<commit_message>
Updated 'noiseTraj' with lognormal distance. Replaces normal independant position for modelling breakpoint distribution. y coordinates is still modelled the same independant way.
</commit_message>
<xml_diff>
--- a/inst/simSDI.docx
+++ b/inst/simSDI.docx
@@ -32,7 +32,19 @@
         <w:rPr>
           <w:lang w:val="en-US"/>
         </w:rPr>
-        <w:t>To simulate SDI trajectories from known breakpoints normal distributions, the way to proceed is the following</w:t>
+        <w:t xml:space="preserve">To simulate SDI trajectories from known </w:t>
+      </w:r>
+      <w:r>
+        <w:rPr>
+          <w:lang w:val="en-US"/>
+        </w:rPr>
+        <w:t xml:space="preserve">normally distributed </w:t>
+      </w:r>
+      <w:r>
+        <w:rPr>
+          <w:lang w:val="en-US"/>
+        </w:rPr>
+        <w:t>breakpoints, the way to proceed is the following</w:t>
       </w:r>
       <w:r>
         <w:rPr>
@@ -60,6 +72,7 @@
           <w:lang w:val="en-US"/>
         </w:rPr>
       </w:pPr>
+      <w:proofErr w:type="spellStart"/>
       <w:r>
         <w:rPr>
           <w:b/>
@@ -68,6 +81,7 @@
         </w:rPr>
         <w:t>trueTraj</w:t>
       </w:r>
+      <w:proofErr w:type="spellEnd"/>
       <w:r>
         <w:rPr>
           <w:b/>
@@ -101,7 +115,19 @@
         <w:rPr>
           <w:lang w:val="en-US"/>
         </w:rPr>
-        <w:t>Population-level specification includes br</w:t>
+        <w:t>Population-level specification includes</w:t>
+      </w:r>
+      <w:r>
+        <w:rPr>
+          <w:lang w:val="en-US"/>
+        </w:rPr>
+        <w:t xml:space="preserve"> “10”-pattern of the trajectory,</w:t>
+      </w:r>
+      <w:r>
+        <w:rPr>
+          <w:lang w:val="en-US"/>
+        </w:rPr>
+        <w:t> br</w:t>
       </w:r>
       <w:r>
         <w:rPr>
@@ -229,7 +255,21 @@
         <w:rPr>
           <w:lang w:val="en-US"/>
         </w:rPr>
-        <w:t xml:space="preserve"> - Default plotting method for object of class `trajTruth`</w:t>
+        <w:t xml:space="preserve"> - Default plotting method for object of class `</w:t>
+      </w:r>
+      <w:proofErr w:type="spellStart"/>
+      <w:r>
+        <w:rPr>
+          <w:lang w:val="en-US"/>
+        </w:rPr>
+        <w:t>trajTruth</w:t>
+      </w:r>
+      <w:proofErr w:type="spellEnd"/>
+      <w:r>
+        <w:rPr>
+          <w:lang w:val="en-US"/>
+        </w:rPr>
+        <w:t>`</w:t>
       </w:r>
     </w:p>
     <w:p>
@@ -252,6 +292,7 @@
           <w:lang w:val="en-US"/>
         </w:rPr>
       </w:pPr>
+      <w:proofErr w:type="spellStart"/>
       <w:r>
         <w:rPr>
           <w:b/>
@@ -260,6 +301,7 @@
         </w:rPr>
         <w:t>noiseTraj</w:t>
       </w:r>
+      <w:proofErr w:type="spellEnd"/>
       <w:r>
         <w:rPr>
           <w:b/>
@@ -319,7 +361,21 @@
         <w:rPr>
           <w:lang w:val="en-US"/>
         </w:rPr>
-        <w:t xml:space="preserve">: sd on the times of measurements during the simulated experiment </w:t>
+        <w:t xml:space="preserve">: </w:t>
+      </w:r>
+      <w:proofErr w:type="spellStart"/>
+      <w:r>
+        <w:rPr>
+          <w:lang w:val="en-US"/>
+        </w:rPr>
+        <w:t>sd</w:t>
+      </w:r>
+      <w:proofErr w:type="spellEnd"/>
+      <w:r>
+        <w:rPr>
+          <w:lang w:val="en-US"/>
+        </w:rPr>
+        <w:t xml:space="preserve"> on the times of measurements during the simulated experiment </w:t>
       </w:r>
     </w:p>
     <w:p>
@@ -411,7 +467,21 @@
         <w:rPr>
           <w:lang w:val="en-US"/>
         </w:rPr>
-        <w:t xml:space="preserve"> sd of normal distribution of breakpoints. Needs to be specified for both x and y coordinates, which are simulated independently.</w:t>
+        <w:t xml:space="preserve"> </w:t>
+      </w:r>
+      <w:proofErr w:type="spellStart"/>
+      <w:r>
+        <w:rPr>
+          <w:lang w:val="en-US"/>
+        </w:rPr>
+        <w:t>sd</w:t>
+      </w:r>
+      <w:proofErr w:type="spellEnd"/>
+      <w:r>
+        <w:rPr>
+          <w:lang w:val="en-US"/>
+        </w:rPr>
+        <w:t xml:space="preserve"> of normal distribution of breakpoints. Needs to be specified for both x and y coordinates, which are simulated independently.</w:t>
       </w:r>
     </w:p>
     <w:p>
@@ -438,6 +508,7 @@
           <w:lang w:val="en-US"/>
         </w:rPr>
       </w:pPr>
+      <w:proofErr w:type="spellStart"/>
       <w:r>
         <w:rPr>
           <w:i/>
@@ -445,8 +516,20 @@
           <w:highlight w:val="yellow"/>
           <w:lang w:val="en-US"/>
         </w:rPr>
-        <w:t>break.x.dist</w:t>
-      </w:r>
+        <w:t>break.</w:t>
+      </w:r>
+      <w:proofErr w:type="gramStart"/>
+      <w:r>
+        <w:rPr>
+          <w:i/>
+          <w:iCs/>
+          <w:highlight w:val="yellow"/>
+          <w:lang w:val="en-US"/>
+        </w:rPr>
+        <w:t>x.dist</w:t>
+      </w:r>
+      <w:proofErr w:type="spellEnd"/>
+      <w:proofErr w:type="gramEnd"/>
       <w:r>
         <w:rPr>
           <w:highlight w:val="yellow"/>
@@ -474,6 +557,8 @@
           <w:lang w:val="en-US"/>
         </w:rPr>
       </w:pPr>
+      <w:proofErr w:type="spellStart"/>
+      <w:proofErr w:type="gramStart"/>
       <w:r>
         <w:rPr>
           <w:i/>
@@ -482,6 +567,8 @@
         </w:rPr>
         <w:t>outlier.prob</w:t>
       </w:r>
+      <w:proofErr w:type="spellEnd"/>
+      <w:proofErr w:type="gramEnd"/>
       <w:r>
         <w:rPr>
           <w:lang w:val="en-US"/>
@@ -502,6 +589,8 @@
           <w:lang w:val="en-US"/>
         </w:rPr>
       </w:pPr>
+      <w:proofErr w:type="spellStart"/>
+      <w:proofErr w:type="gramStart"/>
       <w:r>
         <w:rPr>
           <w:i/>
@@ -510,6 +599,8 @@
         </w:rPr>
         <w:t>na.prob</w:t>
       </w:r>
+      <w:proofErr w:type="spellEnd"/>
+      <w:proofErr w:type="gramEnd"/>
       <w:r>
         <w:rPr>
           <w:lang w:val="en-US"/>
@@ -530,6 +621,8 @@
           <w:lang w:val="en-US"/>
         </w:rPr>
       </w:pPr>
+      <w:proofErr w:type="spellStart"/>
+      <w:proofErr w:type="gramStart"/>
       <w:r>
         <w:rPr>
           <w:i/>
@@ -539,11 +632,19 @@
         <w:lastRenderedPageBreak/>
         <w:t>n.trail</w:t>
       </w:r>
+      <w:proofErr w:type="spellEnd"/>
+      <w:proofErr w:type="gramEnd"/>
       <w:r>
         <w:rPr>
           <w:lang w:val="en-US"/>
         </w:rPr>
         <w:t>: number of trailing observations at the end of the trajectory. Ignored if simulated pattern already ends with a plateau. Exact number may vary individually due to noise on the time of measurement.</w:t>
+      </w:r>
+      <w:r>
+        <w:rPr>
+          <w:lang w:val="en-US"/>
+        </w:rPr>
+        <w:t xml:space="preserve"> Default is -1, meaning we don’t wait until return to true normal level of SDI to finish the experiment.</w:t>
       </w:r>
     </w:p>
     <w:p>
@@ -557,10 +658,10 @@
           <w:lang w:val="en-US"/>
         </w:rPr>
         <w:drawing>
-          <wp:inline distT="0" distB="0" distL="0" distR="0" wp14:anchorId="43492880" wp14:editId="3FDA468A">
-            <wp:extent cx="4767206" cy="3188524"/>
-            <wp:effectExtent l="0" t="0" r="0" b="0"/>
-            <wp:docPr id="873488040" name="Picture 1"/>
+          <wp:inline distT="0" distB="0" distL="0" distR="0" wp14:anchorId="0FD10D70" wp14:editId="4212EFC4">
+            <wp:extent cx="4779034" cy="3013767"/>
+            <wp:effectExtent l="0" t="0" r="2540" b="0"/>
+            <wp:docPr id="851498087" name="Picture 1"/>
             <wp:cNvGraphicFramePr>
               <a:graphicFrameLocks xmlns:a="http://schemas.openxmlformats.org/drawingml/2006/main" noChangeAspect="1"/>
             </wp:cNvGraphicFramePr>
@@ -568,7 +669,7 @@
               <a:graphicData uri="http://schemas.openxmlformats.org/drawingml/2006/picture">
                 <pic:pic xmlns:pic="http://schemas.openxmlformats.org/drawingml/2006/picture">
                   <pic:nvPicPr>
-                    <pic:cNvPr id="873488040" name=""/>
+                    <pic:cNvPr id="851498087" name=""/>
                     <pic:cNvPicPr/>
                   </pic:nvPicPr>
                   <pic:blipFill>
@@ -580,7 +681,7 @@
                   <pic:spPr>
                     <a:xfrm>
                       <a:off x="0" y="0"/>
-                      <a:ext cx="4884626" cy="3267060"/>
+                      <a:ext cx="4785496" cy="3017842"/>
                     </a:xfrm>
                     <a:prstGeom prst="rect">
                       <a:avLst/>
@@ -638,21 +739,18 @@
     </w:p>
     <w:p>
       <w:pPr>
+        <w:keepNext/>
         <w:jc w:val="center"/>
-        <w:rPr>
-          <w:lang w:val="en-US"/>
-        </w:rPr>
       </w:pPr>
       <w:r>
         <w:rPr>
           <w:noProof/>
-          <w:lang w:val="en-US"/>
         </w:rPr>
         <w:drawing>
-          <wp:inline distT="0" distB="0" distL="0" distR="0" wp14:anchorId="781585A7" wp14:editId="635D99FF">
-            <wp:extent cx="2372497" cy="1168375"/>
-            <wp:effectExtent l="0" t="0" r="0" b="0"/>
-            <wp:docPr id="1299915403" name="Picture 1"/>
+          <wp:inline distT="0" distB="0" distL="0" distR="0" wp14:anchorId="6EA1BB4F" wp14:editId="4D1E957B">
+            <wp:extent cx="1682151" cy="1083860"/>
+            <wp:effectExtent l="0" t="0" r="0" b="2540"/>
+            <wp:docPr id="1073572665" name="Picture 1"/>
             <wp:cNvGraphicFramePr>
               <a:graphicFrameLocks xmlns:a="http://schemas.openxmlformats.org/drawingml/2006/main" noChangeAspect="1"/>
             </wp:cNvGraphicFramePr>
@@ -660,7 +758,7 @@
               <a:graphicData uri="http://schemas.openxmlformats.org/drawingml/2006/picture">
                 <pic:pic xmlns:pic="http://schemas.openxmlformats.org/drawingml/2006/picture">
                   <pic:nvPicPr>
-                    <pic:cNvPr id="1299915403" name=""/>
+                    <pic:cNvPr id="1073572665" name=""/>
                     <pic:cNvPicPr/>
                   </pic:nvPicPr>
                   <pic:blipFill>
@@ -672,7 +770,7 @@
                   <pic:spPr>
                     <a:xfrm>
                       <a:off x="0" y="0"/>
-                      <a:ext cx="2401899" cy="1182855"/>
+                      <a:ext cx="1696559" cy="1093144"/>
                     </a:xfrm>
                     <a:prstGeom prst="rect">
                       <a:avLst/>
@@ -687,53 +785,1194 @@
     </w:p>
     <w:p>
       <w:pPr>
-        <w:rPr>
-          <w:lang w:val="en-US"/>
-        </w:rPr>
-      </w:pPr>
-      <w:r>
-        <w:rPr>
-          <w:lang w:val="en-US"/>
-        </w:rPr>
-        <w:t>Describe features of function on the graph</w:t>
-      </w:r>
-      <w:r>
-        <w:rPr>
-          <w:lang w:val="en-US"/>
-        </w:rPr>
-        <w:t xml:space="preserve"> and the printed output.</w:t>
-      </w:r>
-    </w:p>
-    <w:p>
-      <w:pPr>
-        <w:rPr>
-          <w:lang w:val="en-US"/>
-        </w:rPr>
-      </w:pPr>
-      <w:r>
-        <w:rPr>
-          <w:lang w:val="en-US"/>
-        </w:rPr>
-        <w:t>Outlier on ind. 1, 2, 6.</w:t>
-      </w:r>
-      <w:r>
-        <w:rPr>
-          <w:lang w:val="en-US"/>
-        </w:rPr>
-        <w:t xml:space="preserve"> Nb of trailing observations may vary depending on noise on time measurements.</w:t>
-      </w:r>
-    </w:p>
-    <w:p>
-      <w:pPr>
-        <w:rPr>
-          <w:lang w:val="en-US"/>
-        </w:rPr>
-      </w:pPr>
-      <w:r>
-        <w:rPr>
-          <w:lang w:val="en-US"/>
-        </w:rPr>
-        <w:t>101 for illustrating but also works with different kinds of pattern: 11, 101, 111, 1010, 1011, etc.</w:t>
+        <w:pStyle w:val="Caption"/>
+        <w:jc w:val="center"/>
+        <w:rPr>
+          <w:lang w:val="en-US"/>
+        </w:rPr>
+      </w:pPr>
+      <w:r>
+        <w:rPr>
+          <w:lang w:val="en-US"/>
+        </w:rPr>
+        <w:t xml:space="preserve">Figure </w:t>
+      </w:r>
+      <w:r>
+        <w:fldChar w:fldCharType="begin"/>
+      </w:r>
+      <w:r>
+        <w:rPr>
+          <w:lang w:val="en-US"/>
+        </w:rPr>
+        <w:instrText xml:space="preserve"> SEQ Figure \* ARABIC </w:instrText>
+      </w:r>
+      <w:r>
+        <w:fldChar w:fldCharType="separate"/>
+      </w:r>
+      <w:r>
+        <w:rPr>
+          <w:noProof/>
+          <w:lang w:val="en-US"/>
+        </w:rPr>
+        <w:t>3</w:t>
+      </w:r>
+      <w:r>
+        <w:fldChar w:fldCharType="end"/>
+      </w:r>
+      <w:r>
+        <w:rPr>
+          <w:lang w:val="en-US"/>
+        </w:rPr>
+        <w:t xml:space="preserve"> - 'print' method for objects of class 'trajData'</w:t>
+      </w:r>
+    </w:p>
+    <w:p>
+      <w:pPr>
+        <w:rPr>
+          <w:lang w:val="en-US"/>
+        </w:rPr>
+      </w:pPr>
+      <w:r>
+        <w:rPr>
+          <w:lang w:val="en-US"/>
+        </w:rPr>
+        <w:t xml:space="preserve">Default ‘plot’ represents the measurement with type (signal, outlier, trailing) along with true individual parameters for every individual. It can be restricted on certain patients with </w:t>
+      </w:r>
+      <w:r>
+        <w:rPr>
+          <w:i/>
+          <w:iCs/>
+          <w:lang w:val="en-US"/>
+        </w:rPr>
+        <w:t>cluster</w:t>
+      </w:r>
+      <w:r>
+        <w:rPr>
+          <w:lang w:val="en-US"/>
+        </w:rPr>
+        <w:t xml:space="preserve"> argument. ‘print’ gives the individual true breakpoints values and can also display simulated data.</w:t>
+      </w:r>
+    </w:p>
+    <w:p>
+      <w:pPr>
+        <w:rPr>
+          <w:lang w:val="en-US"/>
+        </w:rPr>
+      </w:pPr>
+      <w:r>
+        <w:rPr>
+          <w:lang w:val="en-US"/>
+        </w:rPr>
+        <w:t xml:space="preserve">In this example we used the pattern “11” to illustrate, but the function works for every “10”-alike pattern. Pattern of interest to us are 11, 101, 111, 1010 and 1011. </w:t>
+      </w:r>
+      <w:r>
+        <w:rPr>
+          <w:lang w:val="en-US"/>
+        </w:rPr>
+        <w:t xml:space="preserve">The way to change the simulated pattern essentially resides in the design of </w:t>
+      </w:r>
+      <w:r>
+        <w:rPr>
+          <w:i/>
+          <w:iCs/>
+          <w:lang w:val="en-US"/>
+        </w:rPr>
+        <w:t>breakpoints</w:t>
+      </w:r>
+      <w:r>
+        <w:rPr>
+          <w:lang w:val="en-US"/>
+        </w:rPr>
+        <w:t xml:space="preserve"> </w:t>
+      </w:r>
+      <w:proofErr w:type="spellStart"/>
+      <w:r>
+        <w:rPr>
+          <w:lang w:val="en-US"/>
+        </w:rPr>
+        <w:t>dataframe</w:t>
+      </w:r>
+      <w:proofErr w:type="spellEnd"/>
+      <w:r>
+        <w:rPr>
+          <w:lang w:val="en-US"/>
+        </w:rPr>
+        <w:t>.</w:t>
+      </w:r>
+    </w:p>
+    <w:p>
+      <w:pPr>
+        <w:rPr>
+          <w:lang w:val="en-US"/>
+        </w:rPr>
+      </w:pPr>
+      <w:r>
+        <w:rPr>
+          <w:lang w:val="en-US"/>
+        </w:rPr>
+        <w:t xml:space="preserve">See full R script on next page or </w:t>
+      </w:r>
+      <w:r>
+        <w:rPr>
+          <w:lang w:val="en-US"/>
+        </w:rPr>
+        <w:t>W:\noahdegoulange\github\mixedBreak</w:t>
+      </w:r>
+      <w:r>
+        <w:rPr>
+          <w:lang w:val="en-US"/>
+        </w:rPr>
+        <w:t>\test\</w:t>
+      </w:r>
+      <w:r>
+        <w:rPr>
+          <w:lang w:val="en-US"/>
+        </w:rPr>
+        <w:t>noiseTraj-Ex.R</w:t>
+      </w:r>
+    </w:p>
+    <w:p>
+      <w:pPr>
+        <w:rPr>
+          <w:lang w:val="en-US"/>
+        </w:rPr>
+      </w:pPr>
+      <w:r>
+        <w:rPr>
+          <w:lang w:val="en-US"/>
+        </w:rPr>
+        <w:br w:type="page"/>
+      </w:r>
+    </w:p>
+    <w:p>
+      <w:pPr>
+        <w:spacing w:line="168" w:lineRule="auto"/>
+        <w:rPr>
+          <w:lang w:val="fr-FR"/>
+        </w:rPr>
+      </w:pPr>
+      <w:proofErr w:type="gramStart"/>
+      <w:r>
+        <w:rPr>
+          <w:lang w:val="fr-FR"/>
+        </w:rPr>
+        <w:lastRenderedPageBreak/>
+        <w:t>source</w:t>
+      </w:r>
+      <w:proofErr w:type="gramEnd"/>
+      <w:r>
+        <w:rPr>
+          <w:lang w:val="fr-FR"/>
+        </w:rPr>
+        <w:t>("R/</w:t>
+      </w:r>
+      <w:proofErr w:type="spellStart"/>
+      <w:r>
+        <w:rPr>
+          <w:lang w:val="fr-FR"/>
+        </w:rPr>
+        <w:t>trueTraj.R</w:t>
+      </w:r>
+      <w:proofErr w:type="spellEnd"/>
+      <w:r>
+        <w:rPr>
+          <w:lang w:val="fr-FR"/>
+        </w:rPr>
+        <w:t>")</w:t>
+      </w:r>
+    </w:p>
+    <w:p>
+      <w:pPr>
+        <w:spacing w:line="168" w:lineRule="auto"/>
+        <w:rPr>
+          <w:lang w:val="fr-FR"/>
+        </w:rPr>
+      </w:pPr>
+      <w:proofErr w:type="gramStart"/>
+      <w:r>
+        <w:rPr>
+          <w:lang w:val="fr-FR"/>
+        </w:rPr>
+        <w:t>source</w:t>
+      </w:r>
+      <w:proofErr w:type="gramEnd"/>
+      <w:r>
+        <w:rPr>
+          <w:lang w:val="fr-FR"/>
+        </w:rPr>
+        <w:t>("R/</w:t>
+      </w:r>
+      <w:proofErr w:type="spellStart"/>
+      <w:r>
+        <w:rPr>
+          <w:lang w:val="fr-FR"/>
+        </w:rPr>
+        <w:t>noiseTraj.R</w:t>
+      </w:r>
+      <w:proofErr w:type="spellEnd"/>
+      <w:r>
+        <w:rPr>
+          <w:lang w:val="fr-FR"/>
+        </w:rPr>
+        <w:t>")</w:t>
+      </w:r>
+    </w:p>
+    <w:p>
+      <w:pPr>
+        <w:spacing w:line="168" w:lineRule="auto"/>
+        <w:rPr>
+          <w:lang w:val="fr-FR"/>
+        </w:rPr>
+      </w:pPr>
+      <w:proofErr w:type="gramStart"/>
+      <w:r>
+        <w:rPr>
+          <w:lang w:val="fr-FR"/>
+        </w:rPr>
+        <w:t>source</w:t>
+      </w:r>
+      <w:proofErr w:type="gramEnd"/>
+      <w:r>
+        <w:rPr>
+          <w:lang w:val="fr-FR"/>
+        </w:rPr>
+        <w:t>("R/</w:t>
+      </w:r>
+      <w:proofErr w:type="spellStart"/>
+      <w:proofErr w:type="gramStart"/>
+      <w:r>
+        <w:rPr>
+          <w:lang w:val="fr-FR"/>
+        </w:rPr>
+        <w:t>plot.R</w:t>
+      </w:r>
+      <w:proofErr w:type="spellEnd"/>
+      <w:proofErr w:type="gramEnd"/>
+      <w:r>
+        <w:rPr>
+          <w:lang w:val="fr-FR"/>
+        </w:rPr>
+        <w:t>")</w:t>
+      </w:r>
+    </w:p>
+    <w:p>
+      <w:pPr>
+        <w:spacing w:line="168" w:lineRule="auto"/>
+        <w:rPr>
+          <w:lang w:val="fr-FR"/>
+        </w:rPr>
+      </w:pPr>
+      <w:proofErr w:type="gramStart"/>
+      <w:r>
+        <w:rPr>
+          <w:lang w:val="fr-FR"/>
+        </w:rPr>
+        <w:t>source</w:t>
+      </w:r>
+      <w:proofErr w:type="gramEnd"/>
+      <w:r>
+        <w:rPr>
+          <w:lang w:val="fr-FR"/>
+        </w:rPr>
+        <w:t>("R/</w:t>
+      </w:r>
+      <w:proofErr w:type="spellStart"/>
+      <w:proofErr w:type="gramStart"/>
+      <w:r>
+        <w:rPr>
+          <w:lang w:val="fr-FR"/>
+        </w:rPr>
+        <w:t>print.R</w:t>
+      </w:r>
+      <w:proofErr w:type="spellEnd"/>
+      <w:proofErr w:type="gramEnd"/>
+      <w:r>
+        <w:rPr>
+          <w:lang w:val="fr-FR"/>
+        </w:rPr>
+        <w:t>")</w:t>
+      </w:r>
+    </w:p>
+    <w:p>
+      <w:pPr>
+        <w:spacing w:line="168" w:lineRule="auto"/>
+        <w:rPr>
+          <w:lang w:val="fr-FR"/>
+        </w:rPr>
+      </w:pPr>
+    </w:p>
+    <w:p>
+      <w:pPr>
+        <w:spacing w:line="168" w:lineRule="auto"/>
+        <w:rPr>
+          <w:lang w:val="en-US"/>
+        </w:rPr>
+      </w:pPr>
+      <w:r>
+        <w:rPr>
+          <w:lang w:val="en-US"/>
+        </w:rPr>
+        <w:t xml:space="preserve">## </w:t>
+      </w:r>
+      <w:proofErr w:type="spellStart"/>
+      <w:r>
+        <w:rPr>
+          <w:lang w:val="en-US"/>
+        </w:rPr>
+        <w:t>Specifiying</w:t>
+      </w:r>
+      <w:proofErr w:type="spellEnd"/>
+      <w:r>
+        <w:rPr>
+          <w:lang w:val="en-US"/>
+        </w:rPr>
+        <w:t xml:space="preserve"> parameters and noise level</w:t>
+      </w:r>
+    </w:p>
+    <w:p>
+      <w:pPr>
+        <w:spacing w:line="168" w:lineRule="auto"/>
+        <w:rPr>
+          <w:lang w:val="en-US"/>
+        </w:rPr>
+      </w:pPr>
+      <w:r>
+        <w:rPr>
+          <w:lang w:val="en-US"/>
+        </w:rPr>
+        <w:t xml:space="preserve">times &lt;- </w:t>
+      </w:r>
+      <w:proofErr w:type="gramStart"/>
+      <w:r>
+        <w:rPr>
+          <w:lang w:val="en-US"/>
+        </w:rPr>
+        <w:t>list(</w:t>
+      </w:r>
+      <w:proofErr w:type="gramEnd"/>
+      <w:r>
+        <w:rPr>
+          <w:lang w:val="en-US"/>
+        </w:rPr>
+        <w:t>"value" = 20, "</w:t>
+      </w:r>
+      <w:proofErr w:type="spellStart"/>
+      <w:r>
+        <w:rPr>
+          <w:lang w:val="en-US"/>
+        </w:rPr>
+        <w:t>sd</w:t>
+      </w:r>
+      <w:proofErr w:type="spellEnd"/>
+      <w:r>
+        <w:rPr>
+          <w:lang w:val="en-US"/>
+        </w:rPr>
+        <w:t>" = 2)</w:t>
+      </w:r>
+    </w:p>
+    <w:p>
+      <w:pPr>
+        <w:spacing w:line="168" w:lineRule="auto"/>
+        <w:rPr>
+          <w:lang w:val="en-US"/>
+        </w:rPr>
+      </w:pPr>
+      <w:r>
+        <w:rPr>
+          <w:lang w:val="en-US"/>
+        </w:rPr>
+        <w:t xml:space="preserve">break.3 &lt;- </w:t>
+      </w:r>
+      <w:proofErr w:type="spellStart"/>
+      <w:proofErr w:type="gramStart"/>
+      <w:r>
+        <w:rPr>
+          <w:lang w:val="en-US"/>
+        </w:rPr>
+        <w:t>data.frame</w:t>
+      </w:r>
+      <w:proofErr w:type="spellEnd"/>
+      <w:proofErr w:type="gramEnd"/>
+      <w:r>
+        <w:rPr>
+          <w:lang w:val="en-US"/>
+        </w:rPr>
+        <w:t>(</w:t>
+      </w:r>
+    </w:p>
+    <w:p>
+      <w:pPr>
+        <w:spacing w:line="168" w:lineRule="auto"/>
+        <w:rPr>
+          <w:lang w:val="en-US"/>
+        </w:rPr>
+      </w:pPr>
+      <w:r>
+        <w:rPr>
+          <w:lang w:val="en-US"/>
+        </w:rPr>
+        <w:t xml:space="preserve">  pattern = </w:t>
+      </w:r>
+      <w:proofErr w:type="gramStart"/>
+      <w:r>
+        <w:rPr>
+          <w:lang w:val="en-US"/>
+        </w:rPr>
+        <w:t>c(</w:t>
+      </w:r>
+      <w:proofErr w:type="gramEnd"/>
+      <w:r>
+        <w:rPr>
+          <w:lang w:val="en-US"/>
+        </w:rPr>
+        <w:t>1, 1, NA),</w:t>
+      </w:r>
+    </w:p>
+    <w:p>
+      <w:pPr>
+        <w:spacing w:line="168" w:lineRule="auto"/>
+        <w:rPr>
+          <w:lang w:val="en-US"/>
+        </w:rPr>
+      </w:pPr>
+      <w:r>
+        <w:rPr>
+          <w:lang w:val="en-US"/>
+        </w:rPr>
+        <w:t xml:space="preserve">  </w:t>
+      </w:r>
+      <w:proofErr w:type="spellStart"/>
+      <w:r>
+        <w:rPr>
+          <w:lang w:val="en-US"/>
+        </w:rPr>
+        <w:t>bp.x</w:t>
+      </w:r>
+      <w:proofErr w:type="spellEnd"/>
+      <w:r>
+        <w:rPr>
+          <w:lang w:val="en-US"/>
+        </w:rPr>
+        <w:t xml:space="preserve"> = </w:t>
+      </w:r>
+      <w:proofErr w:type="gramStart"/>
+      <w:r>
+        <w:rPr>
+          <w:lang w:val="en-US"/>
+        </w:rPr>
+        <w:t>c(</w:t>
+      </w:r>
+      <w:proofErr w:type="gramEnd"/>
+      <w:r>
+        <w:rPr>
+          <w:lang w:val="en-US"/>
+        </w:rPr>
+        <w:t>0, 180, 300</w:t>
+      </w:r>
+      <w:proofErr w:type="gramStart"/>
+      <w:r>
+        <w:rPr>
+          <w:lang w:val="en-US"/>
+        </w:rPr>
+        <w:t xml:space="preserve">),   </w:t>
+      </w:r>
+      <w:proofErr w:type="gramEnd"/>
+      <w:r>
+        <w:rPr>
+          <w:lang w:val="en-US"/>
+        </w:rPr>
+        <w:t xml:space="preserve"> # psi, time coordinate of breakpoints</w:t>
+      </w:r>
+    </w:p>
+    <w:p>
+      <w:pPr>
+        <w:spacing w:line="168" w:lineRule="auto"/>
+        <w:rPr>
+          <w:lang w:val="en-US"/>
+        </w:rPr>
+      </w:pPr>
+      <w:r>
+        <w:rPr>
+          <w:lang w:val="en-US"/>
+        </w:rPr>
+        <w:t xml:space="preserve">  </w:t>
+      </w:r>
+      <w:proofErr w:type="spellStart"/>
+      <w:proofErr w:type="gramStart"/>
+      <w:r>
+        <w:rPr>
+          <w:lang w:val="en-US"/>
+        </w:rPr>
+        <w:t>bp.y</w:t>
+      </w:r>
+      <w:proofErr w:type="spellEnd"/>
+      <w:proofErr w:type="gramEnd"/>
+      <w:r>
+        <w:rPr>
+          <w:lang w:val="en-US"/>
+        </w:rPr>
+        <w:t xml:space="preserve"> = </w:t>
+      </w:r>
+      <w:proofErr w:type="gramStart"/>
+      <w:r>
+        <w:rPr>
+          <w:lang w:val="en-US"/>
+        </w:rPr>
+        <w:t>c(</w:t>
+      </w:r>
+      <w:proofErr w:type="gramEnd"/>
+      <w:r>
+        <w:rPr>
+          <w:lang w:val="en-US"/>
+        </w:rPr>
+        <w:t>0, 9.5, 1</w:t>
+      </w:r>
+      <w:proofErr w:type="gramStart"/>
+      <w:r>
+        <w:rPr>
+          <w:lang w:val="en-US"/>
+        </w:rPr>
+        <w:t xml:space="preserve">),   </w:t>
+      </w:r>
+      <w:proofErr w:type="gramEnd"/>
+      <w:r>
+        <w:rPr>
+          <w:lang w:val="en-US"/>
+        </w:rPr>
+        <w:t xml:space="preserve">   # height of breakpoints</w:t>
+      </w:r>
+    </w:p>
+    <w:p>
+      <w:pPr>
+        <w:spacing w:line="168" w:lineRule="auto"/>
+        <w:rPr>
+          <w:lang w:val="fr-FR"/>
+        </w:rPr>
+      </w:pPr>
+      <w:r>
+        <w:rPr>
+          <w:lang w:val="en-US"/>
+        </w:rPr>
+        <w:t xml:space="preserve">  </w:t>
+      </w:r>
+      <w:r>
+        <w:rPr>
+          <w:lang w:val="fr-FR"/>
+        </w:rPr>
+        <w:t xml:space="preserve">bp.x.sd = </w:t>
+      </w:r>
+      <w:proofErr w:type="gramStart"/>
+      <w:r>
+        <w:rPr>
+          <w:lang w:val="fr-FR"/>
+        </w:rPr>
+        <w:t>c(</w:t>
+      </w:r>
+      <w:proofErr w:type="gramEnd"/>
+      <w:r>
+        <w:rPr>
+          <w:lang w:val="fr-FR"/>
+        </w:rPr>
+        <w:t>0, 50, 50</w:t>
+      </w:r>
+      <w:proofErr w:type="gramStart"/>
+      <w:r>
+        <w:rPr>
+          <w:lang w:val="fr-FR"/>
+        </w:rPr>
+        <w:t xml:space="preserve">),   </w:t>
+      </w:r>
+      <w:proofErr w:type="gramEnd"/>
+      <w:r>
+        <w:rPr>
+          <w:lang w:val="fr-FR"/>
+        </w:rPr>
+        <w:t xml:space="preserve"># noise </w:t>
+      </w:r>
+      <w:proofErr w:type="spellStart"/>
+      <w:r>
+        <w:rPr>
+          <w:lang w:val="fr-FR"/>
+        </w:rPr>
+        <w:t>levels</w:t>
+      </w:r>
+      <w:proofErr w:type="spellEnd"/>
+    </w:p>
+    <w:p>
+      <w:pPr>
+        <w:spacing w:line="168" w:lineRule="auto"/>
+        <w:rPr>
+          <w:lang w:val="en-US"/>
+        </w:rPr>
+      </w:pPr>
+      <w:r>
+        <w:rPr>
+          <w:lang w:val="fr-FR"/>
+        </w:rPr>
+        <w:t xml:space="preserve">  </w:t>
+      </w:r>
+      <w:r>
+        <w:rPr>
+          <w:lang w:val="en-US"/>
+        </w:rPr>
+        <w:t xml:space="preserve">bp.y.sd = </w:t>
+      </w:r>
+      <w:proofErr w:type="gramStart"/>
+      <w:r>
+        <w:rPr>
+          <w:lang w:val="en-US"/>
+        </w:rPr>
+        <w:t>c(</w:t>
+      </w:r>
+      <w:proofErr w:type="gramEnd"/>
+      <w:r>
+        <w:rPr>
+          <w:lang w:val="en-US"/>
+        </w:rPr>
+        <w:t>0, 1, 1)</w:t>
+      </w:r>
+    </w:p>
+    <w:p>
+      <w:pPr>
+        <w:spacing w:line="168" w:lineRule="auto"/>
+        <w:rPr>
+          <w:lang w:val="en-US"/>
+        </w:rPr>
+      </w:pPr>
+      <w:r>
+        <w:rPr>
+          <w:lang w:val="en-US"/>
+        </w:rPr>
+        <w:t>)</w:t>
+      </w:r>
+    </w:p>
+    <w:p>
+      <w:pPr>
+        <w:spacing w:line="168" w:lineRule="auto"/>
+        <w:rPr>
+          <w:lang w:val="en-US"/>
+        </w:rPr>
+      </w:pPr>
+    </w:p>
+    <w:p>
+      <w:pPr>
+        <w:spacing w:line="168" w:lineRule="auto"/>
+        <w:rPr>
+          <w:lang w:val="en-US"/>
+        </w:rPr>
+      </w:pPr>
+      <w:proofErr w:type="spellStart"/>
+      <w:proofErr w:type="gramStart"/>
+      <w:r>
+        <w:rPr>
+          <w:lang w:val="en-US"/>
+        </w:rPr>
+        <w:t>outlier.prob</w:t>
+      </w:r>
+      <w:proofErr w:type="spellEnd"/>
+      <w:proofErr w:type="gramEnd"/>
+      <w:r>
+        <w:rPr>
+          <w:lang w:val="en-US"/>
+        </w:rPr>
+        <w:t xml:space="preserve"> &lt;- 1 / 2 # individual probability of having exactly one outlier observation</w:t>
+      </w:r>
+    </w:p>
+    <w:p>
+      <w:pPr>
+        <w:spacing w:line="168" w:lineRule="auto"/>
+        <w:rPr>
+          <w:lang w:val="en-US"/>
+        </w:rPr>
+      </w:pPr>
+      <w:proofErr w:type="spellStart"/>
+      <w:proofErr w:type="gramStart"/>
+      <w:r>
+        <w:rPr>
+          <w:lang w:val="en-US"/>
+        </w:rPr>
+        <w:t>na.prob</w:t>
+      </w:r>
+      <w:proofErr w:type="spellEnd"/>
+      <w:proofErr w:type="gramEnd"/>
+      <w:r>
+        <w:rPr>
+          <w:lang w:val="en-US"/>
+        </w:rPr>
+        <w:t xml:space="preserve"> &lt;- 1 / 10 # measurement probability to be missing</w:t>
+      </w:r>
+    </w:p>
+    <w:p>
+      <w:pPr>
+        <w:spacing w:line="168" w:lineRule="auto"/>
+        <w:rPr>
+          <w:lang w:val="en-US"/>
+        </w:rPr>
+      </w:pPr>
+      <w:proofErr w:type="spellStart"/>
+      <w:proofErr w:type="gramStart"/>
+      <w:r>
+        <w:rPr>
+          <w:lang w:val="en-US"/>
+        </w:rPr>
+        <w:t>n.trail</w:t>
+      </w:r>
+      <w:proofErr w:type="spellEnd"/>
+      <w:proofErr w:type="gramEnd"/>
+      <w:r>
+        <w:rPr>
+          <w:lang w:val="en-US"/>
+        </w:rPr>
+        <w:t xml:space="preserve"> &lt;- 2L # </w:t>
+      </w:r>
+      <w:proofErr w:type="spellStart"/>
+      <w:r>
+        <w:rPr>
+          <w:lang w:val="en-US"/>
+        </w:rPr>
+        <w:t>nb</w:t>
+      </w:r>
+      <w:proofErr w:type="spellEnd"/>
+      <w:r>
+        <w:rPr>
+          <w:lang w:val="en-US"/>
+        </w:rPr>
+        <w:t xml:space="preserve"> of trailing observations (default is -1)</w:t>
+      </w:r>
+    </w:p>
+    <w:p>
+      <w:pPr>
+        <w:spacing w:line="168" w:lineRule="auto"/>
+        <w:rPr>
+          <w:lang w:val="en-US"/>
+        </w:rPr>
+      </w:pPr>
+      <w:proofErr w:type="spellStart"/>
+      <w:proofErr w:type="gramStart"/>
+      <w:r>
+        <w:rPr>
+          <w:lang w:val="en-US"/>
+        </w:rPr>
+        <w:t>break.min.dist</w:t>
+      </w:r>
+      <w:proofErr w:type="spellEnd"/>
+      <w:proofErr w:type="gramEnd"/>
+      <w:r>
+        <w:rPr>
+          <w:lang w:val="en-US"/>
+        </w:rPr>
+        <w:t xml:space="preserve"> &lt;- </w:t>
+      </w:r>
+      <w:proofErr w:type="gramStart"/>
+      <w:r>
+        <w:rPr>
+          <w:lang w:val="en-US"/>
+        </w:rPr>
+        <w:t>list(</w:t>
+      </w:r>
+      <w:proofErr w:type="gramEnd"/>
+      <w:r>
+        <w:rPr>
+          <w:lang w:val="en-US"/>
+        </w:rPr>
+        <w:t>x = 45, y = 0) # min between-breakpoints distance</w:t>
+      </w:r>
+    </w:p>
+    <w:p>
+      <w:pPr>
+        <w:spacing w:line="168" w:lineRule="auto"/>
+        <w:rPr>
+          <w:lang w:val="en-US"/>
+        </w:rPr>
+      </w:pPr>
+    </w:p>
+    <w:p>
+      <w:pPr>
+        <w:spacing w:line="168" w:lineRule="auto"/>
+        <w:rPr>
+          <w:lang w:val="en-US"/>
+        </w:rPr>
+      </w:pPr>
+      <w:proofErr w:type="spellStart"/>
+      <w:r>
+        <w:rPr>
+          <w:lang w:val="en-US"/>
+        </w:rPr>
+        <w:t>n.obs</w:t>
+      </w:r>
+      <w:proofErr w:type="spellEnd"/>
+      <w:r>
+        <w:rPr>
+          <w:lang w:val="en-US"/>
+        </w:rPr>
+        <w:t xml:space="preserve"> &lt;- 6L # </w:t>
+      </w:r>
+      <w:proofErr w:type="spellStart"/>
+      <w:r>
+        <w:rPr>
+          <w:lang w:val="en-US"/>
+        </w:rPr>
+        <w:t>nb</w:t>
+      </w:r>
+      <w:proofErr w:type="spellEnd"/>
+      <w:r>
+        <w:rPr>
+          <w:lang w:val="en-US"/>
+        </w:rPr>
+        <w:t xml:space="preserve"> of patients</w:t>
+      </w:r>
+    </w:p>
+    <w:p>
+      <w:pPr>
+        <w:spacing w:line="168" w:lineRule="auto"/>
+        <w:rPr>
+          <w:lang w:val="en-US"/>
+        </w:rPr>
+      </w:pPr>
+      <w:r>
+        <w:rPr>
+          <w:lang w:val="en-US"/>
+        </w:rPr>
+        <w:t>score.sd &lt;- .5</w:t>
+      </w:r>
+    </w:p>
+    <w:p>
+      <w:pPr>
+        <w:spacing w:line="168" w:lineRule="auto"/>
+        <w:rPr>
+          <w:lang w:val="en-US"/>
+        </w:rPr>
+      </w:pPr>
+    </w:p>
+    <w:p>
+      <w:pPr>
+        <w:spacing w:line="168" w:lineRule="auto"/>
+        <w:rPr>
+          <w:lang w:val="en-US"/>
+        </w:rPr>
+      </w:pPr>
+      <w:proofErr w:type="spellStart"/>
+      <w:proofErr w:type="gramStart"/>
+      <w:r>
+        <w:rPr>
+          <w:lang w:val="en-US"/>
+        </w:rPr>
+        <w:t>true.traj</w:t>
+      </w:r>
+      <w:proofErr w:type="spellEnd"/>
+      <w:proofErr w:type="gramEnd"/>
+      <w:r>
+        <w:rPr>
+          <w:lang w:val="en-US"/>
+        </w:rPr>
+        <w:t xml:space="preserve"> &lt;- </w:t>
+      </w:r>
+      <w:proofErr w:type="spellStart"/>
+      <w:r>
+        <w:rPr>
+          <w:lang w:val="en-US"/>
+        </w:rPr>
+        <w:t>trueTraj</w:t>
+      </w:r>
+      <w:proofErr w:type="spellEnd"/>
+      <w:r>
+        <w:rPr>
+          <w:lang w:val="en-US"/>
+        </w:rPr>
+        <w:t>(times[["value"]], break.3[1:3])</w:t>
+      </w:r>
+    </w:p>
+    <w:p>
+      <w:pPr>
+        <w:spacing w:line="168" w:lineRule="auto"/>
+        <w:rPr>
+          <w:lang w:val="en-US"/>
+        </w:rPr>
+      </w:pPr>
+      <w:r>
+        <w:rPr>
+          <w:lang w:val="en-US"/>
+        </w:rPr>
+        <w:t>plot(</w:t>
+      </w:r>
+      <w:proofErr w:type="spellStart"/>
+      <w:proofErr w:type="gramStart"/>
+      <w:r>
+        <w:rPr>
+          <w:lang w:val="en-US"/>
+        </w:rPr>
+        <w:t>true.traj</w:t>
+      </w:r>
+      <w:proofErr w:type="spellEnd"/>
+      <w:proofErr w:type="gramEnd"/>
+      <w:r>
+        <w:rPr>
+          <w:lang w:val="en-US"/>
+        </w:rPr>
+        <w:t>)</w:t>
+      </w:r>
+    </w:p>
+    <w:p>
+      <w:pPr>
+        <w:spacing w:line="168" w:lineRule="auto"/>
+        <w:rPr>
+          <w:lang w:val="en-US"/>
+        </w:rPr>
+      </w:pPr>
+    </w:p>
+    <w:p>
+      <w:pPr>
+        <w:spacing w:line="168" w:lineRule="auto"/>
+        <w:rPr>
+          <w:lang w:val="en-US"/>
+        </w:rPr>
+      </w:pPr>
+      <w:proofErr w:type="spellStart"/>
+      <w:r>
+        <w:rPr>
+          <w:lang w:val="en-US"/>
+        </w:rPr>
+        <w:t>sim.data</w:t>
+      </w:r>
+      <w:proofErr w:type="spellEnd"/>
+      <w:r>
+        <w:rPr>
+          <w:lang w:val="en-US"/>
+        </w:rPr>
+        <w:t xml:space="preserve"> &lt;- </w:t>
+      </w:r>
+      <w:proofErr w:type="spellStart"/>
+      <w:proofErr w:type="gramStart"/>
+      <w:r>
+        <w:rPr>
+          <w:lang w:val="en-US"/>
+        </w:rPr>
+        <w:t>noiseTraj</w:t>
+      </w:r>
+      <w:proofErr w:type="spellEnd"/>
+      <w:r>
+        <w:rPr>
+          <w:lang w:val="en-US"/>
+        </w:rPr>
+        <w:t>(</w:t>
+      </w:r>
+      <w:proofErr w:type="spellStart"/>
+      <w:r>
+        <w:rPr>
+          <w:lang w:val="en-US"/>
+        </w:rPr>
+        <w:t>true.traj</w:t>
+      </w:r>
+      <w:proofErr w:type="spellEnd"/>
+      <w:proofErr w:type="gramEnd"/>
+      <w:r>
+        <w:rPr>
+          <w:lang w:val="en-US"/>
+        </w:rPr>
+        <w:t xml:space="preserve">, </w:t>
+      </w:r>
+      <w:proofErr w:type="spellStart"/>
+      <w:r>
+        <w:rPr>
+          <w:lang w:val="en-US"/>
+        </w:rPr>
+        <w:t>n.obs</w:t>
+      </w:r>
+      <w:proofErr w:type="spellEnd"/>
+      <w:r>
+        <w:rPr>
+          <w:lang w:val="en-US"/>
+        </w:rPr>
+        <w:t>, score.sd, times.sd = times[["</w:t>
+      </w:r>
+      <w:proofErr w:type="spellStart"/>
+      <w:r>
+        <w:rPr>
+          <w:lang w:val="en-US"/>
+        </w:rPr>
+        <w:t>sd</w:t>
+      </w:r>
+      <w:proofErr w:type="spellEnd"/>
+      <w:r>
+        <w:rPr>
+          <w:lang w:val="en-US"/>
+        </w:rPr>
+        <w:t>"]],</w:t>
+      </w:r>
+    </w:p>
+    <w:p>
+      <w:pPr>
+        <w:spacing w:line="168" w:lineRule="auto"/>
+        <w:rPr>
+          <w:lang w:val="en-US"/>
+        </w:rPr>
+      </w:pPr>
+      <w:r>
+        <w:rPr>
+          <w:lang w:val="en-US"/>
+        </w:rPr>
+        <w:t xml:space="preserve">                      breakpoints.sd = break.3[4:5], </w:t>
+      </w:r>
+      <w:proofErr w:type="spellStart"/>
+      <w:r>
+        <w:rPr>
+          <w:lang w:val="en-US"/>
+        </w:rPr>
+        <w:t>break.</w:t>
+      </w:r>
+      <w:proofErr w:type="gramStart"/>
+      <w:r>
+        <w:rPr>
+          <w:lang w:val="en-US"/>
+        </w:rPr>
+        <w:t>x.dist</w:t>
+      </w:r>
+      <w:proofErr w:type="spellEnd"/>
+      <w:proofErr w:type="gramEnd"/>
+      <w:r>
+        <w:rPr>
+          <w:lang w:val="en-US"/>
+        </w:rPr>
+        <w:t xml:space="preserve"> = 20,</w:t>
+      </w:r>
+    </w:p>
+    <w:p>
+      <w:pPr>
+        <w:spacing w:line="168" w:lineRule="auto"/>
+        <w:rPr>
+          <w:lang w:val="en-US"/>
+        </w:rPr>
+      </w:pPr>
+      <w:r>
+        <w:rPr>
+          <w:lang w:val="en-US"/>
+        </w:rPr>
+        <w:t xml:space="preserve">                      </w:t>
+      </w:r>
+      <w:proofErr w:type="spellStart"/>
+      <w:proofErr w:type="gramStart"/>
+      <w:r>
+        <w:rPr>
+          <w:lang w:val="en-US"/>
+        </w:rPr>
+        <w:t>outlier.prob</w:t>
+      </w:r>
+      <w:proofErr w:type="spellEnd"/>
+      <w:proofErr w:type="gramEnd"/>
+      <w:r>
+        <w:rPr>
+          <w:lang w:val="en-US"/>
+        </w:rPr>
+        <w:t xml:space="preserve"> = </w:t>
+      </w:r>
+      <w:proofErr w:type="spellStart"/>
+      <w:proofErr w:type="gramStart"/>
+      <w:r>
+        <w:rPr>
+          <w:lang w:val="en-US"/>
+        </w:rPr>
+        <w:t>outlier.prob</w:t>
+      </w:r>
+      <w:proofErr w:type="spellEnd"/>
+      <w:proofErr w:type="gramEnd"/>
+      <w:r>
+        <w:rPr>
+          <w:lang w:val="en-US"/>
+        </w:rPr>
+        <w:t xml:space="preserve">, </w:t>
+      </w:r>
+      <w:proofErr w:type="spellStart"/>
+      <w:proofErr w:type="gramStart"/>
+      <w:r>
+        <w:rPr>
+          <w:lang w:val="en-US"/>
+        </w:rPr>
+        <w:t>na.prob</w:t>
+      </w:r>
+      <w:proofErr w:type="spellEnd"/>
+      <w:proofErr w:type="gramEnd"/>
+      <w:r>
+        <w:rPr>
+          <w:lang w:val="en-US"/>
+        </w:rPr>
+        <w:t xml:space="preserve"> = </w:t>
+      </w:r>
+      <w:proofErr w:type="spellStart"/>
+      <w:proofErr w:type="gramStart"/>
+      <w:r>
+        <w:rPr>
+          <w:lang w:val="en-US"/>
+        </w:rPr>
+        <w:t>na.prob</w:t>
+      </w:r>
+      <w:proofErr w:type="spellEnd"/>
+      <w:proofErr w:type="gramEnd"/>
+      <w:r>
+        <w:rPr>
+          <w:lang w:val="en-US"/>
+        </w:rPr>
+        <w:t xml:space="preserve">, </w:t>
+      </w:r>
+      <w:proofErr w:type="spellStart"/>
+      <w:proofErr w:type="gramStart"/>
+      <w:r>
+        <w:rPr>
+          <w:lang w:val="en-US"/>
+        </w:rPr>
+        <w:t>n.trail</w:t>
+      </w:r>
+      <w:proofErr w:type="spellEnd"/>
+      <w:proofErr w:type="gramEnd"/>
+      <w:r>
+        <w:rPr>
+          <w:lang w:val="en-US"/>
+        </w:rPr>
+        <w:t xml:space="preserve"> = </w:t>
+      </w:r>
+      <w:proofErr w:type="spellStart"/>
+      <w:proofErr w:type="gramStart"/>
+      <w:r>
+        <w:rPr>
+          <w:lang w:val="en-US"/>
+        </w:rPr>
+        <w:t>n.trail</w:t>
+      </w:r>
+      <w:proofErr w:type="spellEnd"/>
+      <w:proofErr w:type="gramEnd"/>
+      <w:r>
+        <w:rPr>
+          <w:lang w:val="en-US"/>
+        </w:rPr>
+        <w:t>)</w:t>
+      </w:r>
+    </w:p>
+    <w:p>
+      <w:pPr>
+        <w:spacing w:line="168" w:lineRule="auto"/>
+        <w:rPr>
+          <w:lang w:val="en-US"/>
+        </w:rPr>
+      </w:pPr>
+      <w:r>
+        <w:rPr>
+          <w:lang w:val="en-US"/>
+        </w:rPr>
+        <w:t>plot(</w:t>
+      </w:r>
+      <w:proofErr w:type="spellStart"/>
+      <w:r>
+        <w:rPr>
+          <w:lang w:val="en-US"/>
+        </w:rPr>
+        <w:t>sim.data</w:t>
+      </w:r>
+      <w:proofErr w:type="spellEnd"/>
+      <w:r>
+        <w:rPr>
+          <w:lang w:val="en-US"/>
+        </w:rPr>
+        <w:t>)</w:t>
       </w:r>
     </w:p>
     <w:sectPr>

</xml_diff>

<commit_message>
breakpoints height are now simulated with truncated normal law. + added draft of simulation study protocol
</commit_message>
<xml_diff>
--- a/inst/simSDI.docx
+++ b/inst/simSDI.docx
@@ -32,19 +32,19 @@
         <w:rPr>
           <w:lang w:val="en-US"/>
         </w:rPr>
-        <w:t xml:space="preserve">To simulate SDI trajectories from known </w:t>
-      </w:r>
-      <w:r>
-        <w:rPr>
-          <w:lang w:val="en-US"/>
-        </w:rPr>
-        <w:t xml:space="preserve">normally distributed </w:t>
-      </w:r>
-      <w:r>
-        <w:rPr>
-          <w:lang w:val="en-US"/>
-        </w:rPr>
-        <w:t>breakpoints, the way to proceed is the following</w:t>
+        <w:t>To simulate SDI trajectories from known breakpoints</w:t>
+      </w:r>
+      <w:r>
+        <w:rPr>
+          <w:lang w:val="en-US"/>
+        </w:rPr>
+        <w:t xml:space="preserve"> (with log-normal distance between them)</w:t>
+      </w:r>
+      <w:r>
+        <w:rPr>
+          <w:lang w:val="en-US"/>
+        </w:rPr>
+        <w:t>, the way to proceed is the following</w:t>
       </w:r>
       <w:r>
         <w:rPr>
@@ -121,7 +121,20 @@
         <w:rPr>
           <w:lang w:val="en-US"/>
         </w:rPr>
-        <w:t xml:space="preserve"> “10”-pattern of the trajectory,</w:t>
+        <w:t xml:space="preserve"> </w:t>
+      </w:r>
+      <w:r>
+        <w:rPr>
+          <w:u w:val="single"/>
+          <w:lang w:val="en-US"/>
+        </w:rPr>
+        <w:t>“10”-pattern</w:t>
+      </w:r>
+      <w:r>
+        <w:rPr>
+          <w:lang w:val="en-US"/>
+        </w:rPr>
+        <w:t xml:space="preserve"> of the trajectory,</w:t>
       </w:r>
       <w:r>
         <w:rPr>
@@ -176,13 +189,12 @@
       <w:r>
         <w:rPr>
           <w:noProof/>
-          <w:lang w:val="en-US"/>
         </w:rPr>
         <w:drawing>
-          <wp:inline distT="0" distB="0" distL="0" distR="0" wp14:anchorId="5B8EE035" wp14:editId="3768F778">
-            <wp:extent cx="3884371" cy="2603639"/>
-            <wp:effectExtent l="0" t="0" r="1905" b="6350"/>
-            <wp:docPr id="587970858" name="Picture 1"/>
+          <wp:inline distT="0" distB="0" distL="0" distR="0" wp14:anchorId="017DA6DF" wp14:editId="4D893977">
+            <wp:extent cx="4733925" cy="3067139"/>
+            <wp:effectExtent l="0" t="0" r="0" b="0"/>
+            <wp:docPr id="304401025" name="Picture 1"/>
             <wp:cNvGraphicFramePr>
               <a:graphicFrameLocks xmlns:a="http://schemas.openxmlformats.org/drawingml/2006/main" noChangeAspect="1"/>
             </wp:cNvGraphicFramePr>
@@ -190,7 +202,7 @@
               <a:graphicData uri="http://schemas.openxmlformats.org/drawingml/2006/picture">
                 <pic:pic xmlns:pic="http://schemas.openxmlformats.org/drawingml/2006/picture">
                   <pic:nvPicPr>
-                    <pic:cNvPr id="587970858" name=""/>
+                    <pic:cNvPr id="304401025" name=""/>
                     <pic:cNvPicPr/>
                   </pic:nvPicPr>
                   <pic:blipFill>
@@ -202,7 +214,7 @@
                   <pic:spPr>
                     <a:xfrm>
                       <a:off x="0" y="0"/>
-                      <a:ext cx="3886818" cy="2605279"/>
+                      <a:ext cx="4739326" cy="3070638"/>
                     </a:xfrm>
                     <a:prstGeom prst="rect">
                       <a:avLst/>
@@ -335,7 +347,19 @@
         <w:rPr>
           <w:lang w:val="en-US"/>
         </w:rPr>
-        <w:t>The noise level for the parameters is considered as the standard deviation for the normally distributed parameters listed below:</w:t>
+        <w:t xml:space="preserve">The noise level for the parameters is considered as the standard deviation for the </w:t>
+      </w:r>
+      <w:r>
+        <w:rPr>
+          <w:lang w:val="en-US"/>
+        </w:rPr>
+        <w:t xml:space="preserve">(log-) </w:t>
+      </w:r>
+      <w:r>
+        <w:rPr>
+          <w:lang w:val="en-US"/>
+        </w:rPr>
+        <w:t>normally distributed parameters listed below:</w:t>
       </w:r>
     </w:p>
     <w:p>
@@ -481,7 +505,47 @@
         <w:rPr>
           <w:lang w:val="en-US"/>
         </w:rPr>
-        <w:t xml:space="preserve"> of normal distribution of breakpoints. Needs to be specified for both x and y coordinates, which are simulated independently.</w:t>
+        <w:t xml:space="preserve"> of </w:t>
+      </w:r>
+      <w:r>
+        <w:rPr>
+          <w:u w:val="single"/>
+          <w:lang w:val="en-US"/>
+        </w:rPr>
+        <w:t>log-</w:t>
+      </w:r>
+      <w:r>
+        <w:rPr>
+          <w:u w:val="single"/>
+          <w:lang w:val="en-US"/>
+        </w:rPr>
+        <w:t>normal distribution of</w:t>
+      </w:r>
+      <w:r>
+        <w:rPr>
+          <w:u w:val="single"/>
+          <w:lang w:val="en-US"/>
+        </w:rPr>
+        <w:t xml:space="preserve"> distance between</w:t>
+      </w:r>
+      <w:r>
+        <w:rPr>
+          <w:u w:val="single"/>
+          <w:lang w:val="en-US"/>
+        </w:rPr>
+        <w:t xml:space="preserve"> breakpoints</w:t>
+      </w:r>
+      <w:r>
+        <w:rPr>
+          <w:lang w:val="en-US"/>
+        </w:rPr>
+        <w:t xml:space="preserve"> for x axis, and normally distributed for y axis</w:t>
+      </w:r>
+      <w:r>
+        <w:rPr>
+          <w:lang w:val="en-US"/>
+        </w:rPr>
+        <w:t>. Needs to be specified for both x and y coordinates, which are simulated independently.</w:t>
       </w:r>
     </w:p>
     <w:p>
@@ -513,35 +577,16 @@
         <w:rPr>
           <w:i/>
           <w:iCs/>
-          <w:highlight w:val="yellow"/>
-          <w:lang w:val="en-US"/>
-        </w:rPr>
-        <w:t>break.</w:t>
-      </w:r>
-      <w:proofErr w:type="gramStart"/>
-      <w:r>
-        <w:rPr>
-          <w:i/>
-          <w:iCs/>
-          <w:highlight w:val="yellow"/>
-          <w:lang w:val="en-US"/>
-        </w:rPr>
-        <w:t>x.dist</w:t>
-      </w:r>
-      <w:proofErr w:type="spellEnd"/>
-      <w:proofErr w:type="gramEnd"/>
-      <w:r>
-        <w:rPr>
-          <w:highlight w:val="yellow"/>
-          <w:lang w:val="en-US"/>
-        </w:rPr>
-        <w:t xml:space="preserve">: </w:t>
-      </w:r>
-      <w:r>
-        <w:rPr>
-          <w:lang w:val="en-US"/>
-        </w:rPr>
-        <w:t>minimum between-breakpoints distance on the time axis</w:t>
+          <w:lang w:val="en-US"/>
+        </w:rPr>
+        <w:t>n.obs</w:t>
+      </w:r>
+      <w:proofErr w:type="spellEnd"/>
+      <w:r>
+        <w:rPr>
+          <w:lang w:val="en-US"/>
+        </w:rPr>
+        <w:t>: number of individuals to simulate in the dataset.</w:t>
       </w:r>
     </w:p>
     <w:p>
@@ -552,12 +597,18 @@
           <w:numId w:val="2"/>
         </w:numPr>
         <w:rPr>
+          <w:lang w:val="en-US"/>
+        </w:rPr>
+      </w:pPr>
+      <w:proofErr w:type="spellStart"/>
+      <w:r>
+        <w:rPr>
           <w:i/>
           <w:iCs/>
           <w:lang w:val="en-US"/>
         </w:rPr>
-      </w:pPr>
-      <w:proofErr w:type="spellStart"/>
+        <w:t>break.</w:t>
+      </w:r>
       <w:proofErr w:type="gramStart"/>
       <w:r>
         <w:rPr>
@@ -565,7 +616,7 @@
           <w:iCs/>
           <w:lang w:val="en-US"/>
         </w:rPr>
-        <w:t>outlier.prob</w:t>
+        <w:t>x.dist</w:t>
       </w:r>
       <w:proofErr w:type="spellEnd"/>
       <w:proofErr w:type="gramEnd"/>
@@ -573,7 +624,19 @@
         <w:rPr>
           <w:lang w:val="en-US"/>
         </w:rPr>
-        <w:t>: individual probability of having exactly one outlier observation. Outliers are simulated as a drop of 1-3 points in score, to mimic the impact of going to the bathroom during the experiment.</w:t>
+        <w:t xml:space="preserve">: </w:t>
+      </w:r>
+      <w:r>
+        <w:rPr>
+          <w:lang w:val="en-US"/>
+        </w:rPr>
+        <w:t>minimum between-breakpoints distance on the time axis</w:t>
+      </w:r>
+      <w:r>
+        <w:rPr>
+          <w:lang w:val="en-US"/>
+        </w:rPr>
+        <w:t>.</w:t>
       </w:r>
     </w:p>
     <w:p>
@@ -597,7 +660,8 @@
           <w:iCs/>
           <w:lang w:val="en-US"/>
         </w:rPr>
-        <w:t>na.prob</w:t>
+        <w:lastRenderedPageBreak/>
+        <w:t>outlier.prob</w:t>
       </w:r>
       <w:proofErr w:type="spellEnd"/>
       <w:proofErr w:type="gramEnd"/>
@@ -605,7 +669,7 @@
         <w:rPr>
           <w:lang w:val="en-US"/>
         </w:rPr>
-        <w:t>: observation probability of being a missing value</w:t>
+        <w:t>: individual probability of having exactly one outlier observation. Outliers are simulated as a drop of 1-3 points in score, to mimic the impact of going to the bathroom during the experiment.</w:t>
       </w:r>
     </w:p>
     <w:p>
@@ -629,7 +693,38 @@
           <w:iCs/>
           <w:lang w:val="en-US"/>
         </w:rPr>
-        <w:lastRenderedPageBreak/>
+        <w:t>na.prob</w:t>
+      </w:r>
+      <w:proofErr w:type="spellEnd"/>
+      <w:proofErr w:type="gramEnd"/>
+      <w:r>
+        <w:rPr>
+          <w:lang w:val="en-US"/>
+        </w:rPr>
+        <w:t>: observation probability of being a missing value</w:t>
+      </w:r>
+    </w:p>
+    <w:p>
+      <w:pPr>
+        <w:pStyle w:val="ListParagraph"/>
+        <w:numPr>
+          <w:ilvl w:val="0"/>
+          <w:numId w:val="2"/>
+        </w:numPr>
+        <w:rPr>
+          <w:i/>
+          <w:iCs/>
+          <w:lang w:val="en-US"/>
+        </w:rPr>
+      </w:pPr>
+      <w:proofErr w:type="spellStart"/>
+      <w:proofErr w:type="gramStart"/>
+      <w:r>
+        <w:rPr>
+          <w:i/>
+          <w:iCs/>
+          <w:lang w:val="en-US"/>
+        </w:rPr>
         <w:t>n.trail</w:t>
       </w:r>
       <w:proofErr w:type="spellEnd"/>
@@ -655,13 +750,12 @@
       <w:r>
         <w:rPr>
           <w:noProof/>
-          <w:lang w:val="en-US"/>
         </w:rPr>
         <w:drawing>
-          <wp:inline distT="0" distB="0" distL="0" distR="0" wp14:anchorId="0FD10D70" wp14:editId="4212EFC4">
-            <wp:extent cx="4779034" cy="3013767"/>
-            <wp:effectExtent l="0" t="0" r="2540" b="0"/>
-            <wp:docPr id="851498087" name="Picture 1"/>
+          <wp:inline distT="0" distB="0" distL="0" distR="0" wp14:anchorId="6AFF8BC9" wp14:editId="36D250AA">
+            <wp:extent cx="4400550" cy="2856993"/>
+            <wp:effectExtent l="0" t="0" r="0" b="635"/>
+            <wp:docPr id="1110902262" name="Picture 1"/>
             <wp:cNvGraphicFramePr>
               <a:graphicFrameLocks xmlns:a="http://schemas.openxmlformats.org/drawingml/2006/main" noChangeAspect="1"/>
             </wp:cNvGraphicFramePr>
@@ -669,7 +763,7 @@
               <a:graphicData uri="http://schemas.openxmlformats.org/drawingml/2006/picture">
                 <pic:pic xmlns:pic="http://schemas.openxmlformats.org/drawingml/2006/picture">
                   <pic:nvPicPr>
-                    <pic:cNvPr id="851498087" name=""/>
+                    <pic:cNvPr id="1110902262" name=""/>
                     <pic:cNvPicPr/>
                   </pic:nvPicPr>
                   <pic:blipFill>
@@ -681,7 +775,7 @@
                   <pic:spPr>
                     <a:xfrm>
                       <a:off x="0" y="0"/>
-                      <a:ext cx="4785496" cy="3017842"/>
+                      <a:ext cx="4405481" cy="2860194"/>
                     </a:xfrm>
                     <a:prstGeom prst="rect">
                       <a:avLst/>
@@ -747,10 +841,10 @@
           <w:noProof/>
         </w:rPr>
         <w:drawing>
-          <wp:inline distT="0" distB="0" distL="0" distR="0" wp14:anchorId="6EA1BB4F" wp14:editId="4D1E957B">
-            <wp:extent cx="1682151" cy="1083860"/>
-            <wp:effectExtent l="0" t="0" r="0" b="2540"/>
-            <wp:docPr id="1073572665" name="Picture 1"/>
+          <wp:inline distT="0" distB="0" distL="0" distR="0" wp14:anchorId="3E348969" wp14:editId="7CAACE5D">
+            <wp:extent cx="2308860" cy="1133198"/>
+            <wp:effectExtent l="0" t="0" r="0" b="0"/>
+            <wp:docPr id="1019391830" name="Picture 1"/>
             <wp:cNvGraphicFramePr>
               <a:graphicFrameLocks xmlns:a="http://schemas.openxmlformats.org/drawingml/2006/main" noChangeAspect="1"/>
             </wp:cNvGraphicFramePr>
@@ -758,7 +852,7 @@
               <a:graphicData uri="http://schemas.openxmlformats.org/drawingml/2006/picture">
                 <pic:pic xmlns:pic="http://schemas.openxmlformats.org/drawingml/2006/picture">
                   <pic:nvPicPr>
-                    <pic:cNvPr id="1073572665" name=""/>
+                    <pic:cNvPr id="1019391830" name=""/>
                     <pic:cNvPicPr/>
                   </pic:nvPicPr>
                   <pic:blipFill>
@@ -770,7 +864,7 @@
                   <pic:spPr>
                     <a:xfrm>
                       <a:off x="0" y="0"/>
-                      <a:ext cx="1696559" cy="1093144"/>
+                      <a:ext cx="2333423" cy="1145254"/>
                     </a:xfrm>
                     <a:prstGeom prst="rect">
                       <a:avLst/>
@@ -836,7 +930,19 @@
         <w:rPr>
           <w:lang w:val="en-US"/>
         </w:rPr>
-        <w:t xml:space="preserve">Default ‘plot’ represents the measurement with type (signal, outlier, trailing) along with true individual parameters for every individual. It can be restricted on certain patients with </w:t>
+        <w:t>Default ‘plot’ represents the measurement with type (signal, outlier, trailing) along with true individual</w:t>
+      </w:r>
+      <w:r>
+        <w:rPr>
+          <w:lang w:val="en-US"/>
+        </w:rPr>
+        <w:t xml:space="preserve"> trajectories</w:t>
+      </w:r>
+      <w:r>
+        <w:rPr>
+          <w:lang w:val="en-US"/>
+        </w:rPr>
+        <w:t xml:space="preserve">. It can be restricted on certain patients with </w:t>
       </w:r>
       <w:r>
         <w:rPr>
@@ -863,7 +969,19 @@
         <w:rPr>
           <w:lang w:val="en-US"/>
         </w:rPr>
-        <w:t xml:space="preserve">In this example we used the pattern “11” to illustrate, but the function works for every “10”-alike pattern. Pattern of interest to us are 11, 101, 111, 1010 and 1011. </w:t>
+        <w:t>In this example we used the pattern “1</w:t>
+      </w:r>
+      <w:r>
+        <w:rPr>
+          <w:lang w:val="en-US"/>
+        </w:rPr>
+        <w:t>0</w:t>
+      </w:r>
+      <w:r>
+        <w:rPr>
+          <w:lang w:val="en-US"/>
+        </w:rPr>
+        <w:t xml:space="preserve">1” to illustrate, but the function works for every “10”-alike pattern. Pattern of interest to us are 11, 101, 111, 1010 and 1011. </w:t>
       </w:r>
       <w:r>
         <w:rPr>
@@ -930,13 +1048,6 @@
         </w:rPr>
         <w:t>noiseTraj-Ex.R</w:t>
       </w:r>
-    </w:p>
-    <w:p>
-      <w:pPr>
-        <w:rPr>
-          <w:lang w:val="en-US"/>
-        </w:rPr>
-      </w:pPr>
       <w:r>
         <w:rPr>
           <w:lang w:val="en-US"/>

</xml_diff>

<commit_message>
Adde package specifications and SDI desc stats/graphs
</commit_message>
<xml_diff>
--- a/inst/simSDI.docx
+++ b/inst/simSDI.docx
@@ -32,25 +32,130 @@
         <w:rPr>
           <w:lang w:val="en-US"/>
         </w:rPr>
-        <w:t>To simulate SDI trajectories from known breakpoints</w:t>
-      </w:r>
-      <w:r>
-        <w:rPr>
-          <w:lang w:val="en-US"/>
-        </w:rPr>
-        <w:t xml:space="preserve"> (with log-normal distance between them)</w:t>
-      </w:r>
-      <w:r>
-        <w:rPr>
-          <w:lang w:val="en-US"/>
-        </w:rPr>
-        <w:t>, the way to proceed is the following</w:t>
-      </w:r>
-      <w:r>
-        <w:rPr>
-          <w:lang w:val="en-US"/>
-        </w:rPr>
-        <w:t xml:space="preserve"> 2-step process</w:t>
+        <w:t xml:space="preserve">From a mathematical perspective, the way “10” pattern trajectories are simulated is the following: </w:t>
+      </w:r>
+    </w:p>
+    <w:p>
+      <w:pPr>
+        <w:pStyle w:val="ListParagraph"/>
+        <w:numPr>
+          <w:ilvl w:val="0"/>
+          <w:numId w:val="4"/>
+        </w:numPr>
+        <w:rPr>
+          <w:lang w:val="en-US"/>
+        </w:rPr>
+      </w:pPr>
+      <w:r>
+        <w:rPr>
+          <w:lang w:val="en-US"/>
+        </w:rPr>
+        <w:t>The parametrization is the true value of breakpoints coordinates at population level</w:t>
+      </w:r>
+    </w:p>
+    <w:p>
+      <w:pPr>
+        <w:pStyle w:val="ListParagraph"/>
+        <w:numPr>
+          <w:ilvl w:val="0"/>
+          <w:numId w:val="4"/>
+        </w:numPr>
+        <w:rPr>
+          <w:lang w:val="en-US"/>
+        </w:rPr>
+      </w:pPr>
+      <w:r>
+        <w:rPr>
+          <w:lang w:val="en-US"/>
+        </w:rPr>
+        <w:t xml:space="preserve">From this, breaks are simulated </w:t>
+      </w:r>
+      <w:r>
+        <w:rPr>
+          <w:lang w:val="en-US"/>
+        </w:rPr>
+        <w:t>at the individual level, (</w:t>
+      </w:r>
+      <w:proofErr w:type="spellStart"/>
+      <w:r>
+        <w:rPr>
+          <w:lang w:val="en-US"/>
+        </w:rPr>
+        <w:t>x,y</w:t>
+      </w:r>
+      <w:proofErr w:type="spellEnd"/>
+      <w:r>
+        <w:rPr>
+          <w:lang w:val="en-US"/>
+        </w:rPr>
+        <w:t>)-coordinates being independently generated.</w:t>
+      </w:r>
+    </w:p>
+    <w:p>
+      <w:pPr>
+        <w:pStyle w:val="ListParagraph"/>
+        <w:numPr>
+          <w:ilvl w:val="1"/>
+          <w:numId w:val="4"/>
+        </w:numPr>
+        <w:rPr>
+          <w:lang w:val="en-US"/>
+        </w:rPr>
+      </w:pPr>
+      <w:r>
+        <w:rPr>
+          <w:lang w:val="en-US"/>
+        </w:rPr>
+        <w:t>On the x-axis (time), the distance between breaks is simulated with a log normal distribution based on the parameters given by the user.</w:t>
+      </w:r>
+    </w:p>
+    <w:p>
+      <w:pPr>
+        <w:pStyle w:val="ListParagraph"/>
+        <w:numPr>
+          <w:ilvl w:val="1"/>
+          <w:numId w:val="4"/>
+        </w:numPr>
+        <w:rPr>
+          <w:lang w:val="en-US"/>
+        </w:rPr>
+      </w:pPr>
+      <w:r>
+        <w:rPr>
+          <w:lang w:val="en-US"/>
+        </w:rPr>
+        <w:t xml:space="preserve">On the y-axis (SDI), the height is simulated with a normal law truncated between 0-10, which are the boundaries of SDI scale. </w:t>
+      </w:r>
+    </w:p>
+    <w:p>
+      <w:pPr>
+        <w:rPr>
+          <w:lang w:val="en-US"/>
+        </w:rPr>
+      </w:pPr>
+      <w:r>
+        <w:rPr>
+          <w:lang w:val="en-US"/>
+        </w:rPr>
+        <w:t xml:space="preserve">From a coding perspective, a way to simulate </w:t>
+      </w:r>
+      <w:r>
+        <w:rPr>
+          <w:lang w:val="en-US"/>
+        </w:rPr>
+        <w:t>SDI trajectories from known breakpoints</w:t>
+      </w:r>
+      <w:r>
+        <w:rPr>
+          <w:lang w:val="en-US"/>
+        </w:rPr>
+        <w:t xml:space="preserve"> (with log-normal distance between </w:t>
+      </w:r>
+      <w:r>
+        <w:rPr>
+          <w:lang w:val="en-US"/>
+        </w:rPr>
+        <w:t>them) is described in the following 2-step process</w:t>
       </w:r>
       <w:r>
         <w:rPr>
@@ -379,6 +484,7 @@
           <w:iCs/>
           <w:lang w:val="en-US"/>
         </w:rPr>
+        <w:lastRenderedPageBreak/>
         <w:t>times</w:t>
       </w:r>
       <w:r>
@@ -607,19 +713,9 @@
           <w:iCs/>
           <w:lang w:val="en-US"/>
         </w:rPr>
-        <w:t>break.</w:t>
-      </w:r>
-      <w:proofErr w:type="gramStart"/>
-      <w:r>
-        <w:rPr>
-          <w:i/>
-          <w:iCs/>
-          <w:lang w:val="en-US"/>
-        </w:rPr>
-        <w:t>x.dist</w:t>
-      </w:r>
-      <w:proofErr w:type="spellEnd"/>
-      <w:proofErr w:type="gramEnd"/>
+        <w:t>break.x.dist</w:t>
+      </w:r>
+      <w:proofErr w:type="spellEnd"/>
       <w:r>
         <w:rPr>
           <w:lang w:val="en-US"/>
@@ -653,18 +749,15 @@
         </w:rPr>
       </w:pPr>
       <w:proofErr w:type="spellStart"/>
-      <w:proofErr w:type="gramStart"/>
       <w:r>
         <w:rPr>
           <w:i/>
           <w:iCs/>
           <w:lang w:val="en-US"/>
         </w:rPr>
-        <w:lastRenderedPageBreak/>
         <w:t>outlier.prob</w:t>
       </w:r>
       <w:proofErr w:type="spellEnd"/>
-      <w:proofErr w:type="gramEnd"/>
       <w:r>
         <w:rPr>
           <w:lang w:val="en-US"/>
@@ -686,7 +779,6 @@
         </w:rPr>
       </w:pPr>
       <w:proofErr w:type="spellStart"/>
-      <w:proofErr w:type="gramStart"/>
       <w:r>
         <w:rPr>
           <w:i/>
@@ -696,7 +788,6 @@
         <w:t>na.prob</w:t>
       </w:r>
       <w:proofErr w:type="spellEnd"/>
-      <w:proofErr w:type="gramEnd"/>
       <w:r>
         <w:rPr>
           <w:lang w:val="en-US"/>
@@ -718,7 +809,6 @@
         </w:rPr>
       </w:pPr>
       <w:proofErr w:type="spellStart"/>
-      <w:proofErr w:type="gramStart"/>
       <w:r>
         <w:rPr>
           <w:i/>
@@ -728,7 +818,6 @@
         <w:t>n.trail</w:t>
       </w:r>
       <w:proofErr w:type="spellEnd"/>
-      <w:proofErr w:type="gramEnd"/>
       <w:r>
         <w:rPr>
           <w:lang w:val="en-US"/>
@@ -930,6 +1019,7 @@
         <w:rPr>
           <w:lang w:val="en-US"/>
         </w:rPr>
+        <w:lastRenderedPageBreak/>
         <w:t>Default ‘plot’ represents the measurement with type (signal, outlier, trailing) along with true individual</w:t>
       </w:r>
       <w:r>
@@ -1062,33 +1152,53 @@
           <w:lang w:val="fr-FR"/>
         </w:rPr>
       </w:pPr>
-      <w:proofErr w:type="gramStart"/>
       <w:r>
         <w:rPr>
           <w:lang w:val="fr-FR"/>
         </w:rPr>
         <w:lastRenderedPageBreak/>
-        <w:t>source</w:t>
-      </w:r>
-      <w:proofErr w:type="gramEnd"/>
+        <w:t>source("R/</w:t>
+      </w:r>
+      <w:proofErr w:type="spellStart"/>
       <w:r>
         <w:rPr>
           <w:lang w:val="fr-FR"/>
         </w:rPr>
-        <w:t>("R/</w:t>
-      </w:r>
-      <w:proofErr w:type="spellStart"/>
+        <w:t>trueTraj.R</w:t>
+      </w:r>
+      <w:proofErr w:type="spellEnd"/>
       <w:r>
         <w:rPr>
           <w:lang w:val="fr-FR"/>
         </w:rPr>
-        <w:t>trueTraj.R</w:t>
-      </w:r>
-      <w:proofErr w:type="spellEnd"/>
-      <w:r>
+        <w:t>")</w:t>
+      </w:r>
+    </w:p>
+    <w:p>
+      <w:pPr>
+        <w:spacing w:line="168" w:lineRule="auto"/>
         <w:rPr>
           <w:lang w:val="fr-FR"/>
         </w:rPr>
+      </w:pPr>
+      <w:r>
+        <w:rPr>
+          <w:lang w:val="fr-FR"/>
+        </w:rPr>
+        <w:t>source("R/</w:t>
+      </w:r>
+      <w:proofErr w:type="spellStart"/>
+      <w:r>
+        <w:rPr>
+          <w:lang w:val="fr-FR"/>
+        </w:rPr>
+        <w:t>noiseTraj.R</w:t>
+      </w:r>
+      <w:proofErr w:type="spellEnd"/>
+      <w:r>
+        <w:rPr>
+          <w:lang w:val="fr-FR"/>
+        </w:rPr>
         <w:t>")</w:t>
       </w:r>
     </w:p>
@@ -1099,32 +1209,52 @@
           <w:lang w:val="fr-FR"/>
         </w:rPr>
       </w:pPr>
-      <w:proofErr w:type="gramStart"/>
       <w:r>
         <w:rPr>
           <w:lang w:val="fr-FR"/>
         </w:rPr>
-        <w:t>source</w:t>
-      </w:r>
-      <w:proofErr w:type="gramEnd"/>
+        <w:t>source("R/</w:t>
+      </w:r>
+      <w:proofErr w:type="spellStart"/>
       <w:r>
         <w:rPr>
           <w:lang w:val="fr-FR"/>
         </w:rPr>
-        <w:t>("R/</w:t>
-      </w:r>
-      <w:proofErr w:type="spellStart"/>
+        <w:t>plot.R</w:t>
+      </w:r>
+      <w:proofErr w:type="spellEnd"/>
       <w:r>
         <w:rPr>
           <w:lang w:val="fr-FR"/>
         </w:rPr>
-        <w:t>noiseTraj.R</w:t>
-      </w:r>
-      <w:proofErr w:type="spellEnd"/>
-      <w:r>
+        <w:t>")</w:t>
+      </w:r>
+    </w:p>
+    <w:p>
+      <w:pPr>
+        <w:spacing w:line="168" w:lineRule="auto"/>
         <w:rPr>
           <w:lang w:val="fr-FR"/>
         </w:rPr>
+      </w:pPr>
+      <w:r>
+        <w:rPr>
+          <w:lang w:val="fr-FR"/>
+        </w:rPr>
+        <w:t>source("R/</w:t>
+      </w:r>
+      <w:proofErr w:type="spellStart"/>
+      <w:r>
+        <w:rPr>
+          <w:lang w:val="fr-FR"/>
+        </w:rPr>
+        <w:t>print.R</w:t>
+      </w:r>
+      <w:proofErr w:type="spellEnd"/>
+      <w:r>
+        <w:rPr>
+          <w:lang w:val="fr-FR"/>
+        </w:rPr>
         <w:t>")</w:t>
       </w:r>
     </w:p>
@@ -1135,80 +1265,228 @@
           <w:lang w:val="fr-FR"/>
         </w:rPr>
       </w:pPr>
-      <w:proofErr w:type="gramStart"/>
-      <w:r>
+    </w:p>
+    <w:p>
+      <w:pPr>
+        <w:spacing w:line="168" w:lineRule="auto"/>
+        <w:rPr>
+          <w:lang w:val="en-US"/>
+        </w:rPr>
+      </w:pPr>
+      <w:r>
+        <w:rPr>
+          <w:lang w:val="en-US"/>
+        </w:rPr>
+        <w:t xml:space="preserve">## </w:t>
+      </w:r>
+      <w:proofErr w:type="spellStart"/>
+      <w:r>
+        <w:rPr>
+          <w:lang w:val="en-US"/>
+        </w:rPr>
+        <w:t>Specifiying</w:t>
+      </w:r>
+      <w:proofErr w:type="spellEnd"/>
+      <w:r>
+        <w:rPr>
+          <w:lang w:val="en-US"/>
+        </w:rPr>
+        <w:t xml:space="preserve"> parameters and noise level</w:t>
+      </w:r>
+    </w:p>
+    <w:p>
+      <w:pPr>
+        <w:spacing w:line="168" w:lineRule="auto"/>
+        <w:rPr>
+          <w:lang w:val="en-US"/>
+        </w:rPr>
+      </w:pPr>
+      <w:r>
+        <w:rPr>
+          <w:lang w:val="en-US"/>
+        </w:rPr>
+        <w:t>times &lt;- list("value" = 20, "</w:t>
+      </w:r>
+      <w:proofErr w:type="spellStart"/>
+      <w:r>
+        <w:rPr>
+          <w:lang w:val="en-US"/>
+        </w:rPr>
+        <w:t>sd</w:t>
+      </w:r>
+      <w:proofErr w:type="spellEnd"/>
+      <w:r>
+        <w:rPr>
+          <w:lang w:val="en-US"/>
+        </w:rPr>
+        <w:t>" = 2)</w:t>
+      </w:r>
+    </w:p>
+    <w:p>
+      <w:pPr>
+        <w:spacing w:line="168" w:lineRule="auto"/>
+        <w:rPr>
+          <w:lang w:val="en-US"/>
+        </w:rPr>
+      </w:pPr>
+      <w:r>
+        <w:rPr>
+          <w:lang w:val="en-US"/>
+        </w:rPr>
+        <w:t xml:space="preserve">break.3 &lt;- </w:t>
+      </w:r>
+      <w:proofErr w:type="spellStart"/>
+      <w:r>
+        <w:rPr>
+          <w:lang w:val="en-US"/>
+        </w:rPr>
+        <w:t>data.frame</w:t>
+      </w:r>
+      <w:proofErr w:type="spellEnd"/>
+      <w:r>
+        <w:rPr>
+          <w:lang w:val="en-US"/>
+        </w:rPr>
+        <w:t>(</w:t>
+      </w:r>
+    </w:p>
+    <w:p>
+      <w:pPr>
+        <w:spacing w:line="168" w:lineRule="auto"/>
+        <w:rPr>
+          <w:lang w:val="en-US"/>
+        </w:rPr>
+      </w:pPr>
+      <w:r>
+        <w:rPr>
+          <w:lang w:val="en-US"/>
+        </w:rPr>
+        <w:t xml:space="preserve">  pattern = c(1, 1, NA),</w:t>
+      </w:r>
+    </w:p>
+    <w:p>
+      <w:pPr>
+        <w:spacing w:line="168" w:lineRule="auto"/>
+        <w:rPr>
+          <w:lang w:val="en-US"/>
+        </w:rPr>
+      </w:pPr>
+      <w:r>
+        <w:rPr>
+          <w:lang w:val="en-US"/>
+        </w:rPr>
+        <w:t xml:space="preserve">  </w:t>
+      </w:r>
+      <w:proofErr w:type="spellStart"/>
+      <w:r>
+        <w:rPr>
+          <w:lang w:val="en-US"/>
+        </w:rPr>
+        <w:t>bp.x</w:t>
+      </w:r>
+      <w:proofErr w:type="spellEnd"/>
+      <w:r>
+        <w:rPr>
+          <w:lang w:val="en-US"/>
+        </w:rPr>
+        <w:t xml:space="preserve"> = c(0, 180, 300),    # psi, time coordinate of breakpoints</w:t>
+      </w:r>
+    </w:p>
+    <w:p>
+      <w:pPr>
+        <w:spacing w:line="168" w:lineRule="auto"/>
+        <w:rPr>
+          <w:lang w:val="en-US"/>
+        </w:rPr>
+      </w:pPr>
+      <w:r>
+        <w:rPr>
+          <w:lang w:val="en-US"/>
+        </w:rPr>
+        <w:t xml:space="preserve">  </w:t>
+      </w:r>
+      <w:proofErr w:type="spellStart"/>
+      <w:r>
+        <w:rPr>
+          <w:lang w:val="en-US"/>
+        </w:rPr>
+        <w:t>bp.y</w:t>
+      </w:r>
+      <w:proofErr w:type="spellEnd"/>
+      <w:r>
+        <w:rPr>
+          <w:lang w:val="en-US"/>
+        </w:rPr>
+        <w:t xml:space="preserve"> = c(0, 9.5, 1),      # height of breakpoints</w:t>
+      </w:r>
+    </w:p>
+    <w:p>
+      <w:pPr>
+        <w:spacing w:line="168" w:lineRule="auto"/>
         <w:rPr>
           <w:lang w:val="fr-FR"/>
         </w:rPr>
-        <w:t>source</w:t>
-      </w:r>
-      <w:proofErr w:type="gramEnd"/>
+      </w:pPr>
+      <w:r>
+        <w:rPr>
+          <w:lang w:val="en-US"/>
+        </w:rPr>
+        <w:t xml:space="preserve">  </w:t>
+      </w:r>
       <w:r>
         <w:rPr>
           <w:lang w:val="fr-FR"/>
         </w:rPr>
-        <w:t>("R/</w:t>
-      </w:r>
-      <w:proofErr w:type="spellStart"/>
-      <w:proofErr w:type="gramStart"/>
+        <w:t xml:space="preserve">bp.x.sd = c(0, 50, 50),   # noise </w:t>
+      </w:r>
+      <w:proofErr w:type="spellStart"/>
       <w:r>
         <w:rPr>
           <w:lang w:val="fr-FR"/>
         </w:rPr>
-        <w:t>plot.R</w:t>
-      </w:r>
-      <w:proofErr w:type="spellEnd"/>
-      <w:proofErr w:type="gramEnd"/>
+        <w:t>levels</w:t>
+      </w:r>
+      <w:proofErr w:type="spellEnd"/>
+    </w:p>
+    <w:p>
+      <w:pPr>
+        <w:spacing w:line="168" w:lineRule="auto"/>
+        <w:rPr>
+          <w:lang w:val="en-US"/>
+        </w:rPr>
+      </w:pPr>
       <w:r>
         <w:rPr>
           <w:lang w:val="fr-FR"/>
         </w:rPr>
-        <w:t>")</w:t>
+        <w:t xml:space="preserve">  </w:t>
+      </w:r>
+      <w:r>
+        <w:rPr>
+          <w:lang w:val="en-US"/>
+        </w:rPr>
+        <w:t>bp.y.sd = c(0, 1, 1)</w:t>
       </w:r>
     </w:p>
     <w:p>
       <w:pPr>
         <w:spacing w:line="168" w:lineRule="auto"/>
         <w:rPr>
-          <w:lang w:val="fr-FR"/>
-        </w:rPr>
-      </w:pPr>
-      <w:proofErr w:type="gramStart"/>
-      <w:r>
-        <w:rPr>
-          <w:lang w:val="fr-FR"/>
-        </w:rPr>
-        <w:t>source</w:t>
-      </w:r>
-      <w:proofErr w:type="gramEnd"/>
-      <w:r>
-        <w:rPr>
-          <w:lang w:val="fr-FR"/>
-        </w:rPr>
-        <w:t>("R/</w:t>
-      </w:r>
-      <w:proofErr w:type="spellStart"/>
-      <w:proofErr w:type="gramStart"/>
-      <w:r>
-        <w:rPr>
-          <w:lang w:val="fr-FR"/>
-        </w:rPr>
-        <w:t>print.R</w:t>
-      </w:r>
-      <w:proofErr w:type="spellEnd"/>
-      <w:proofErr w:type="gramEnd"/>
-      <w:r>
-        <w:rPr>
-          <w:lang w:val="fr-FR"/>
-        </w:rPr>
-        <w:t>")</w:t>
+          <w:lang w:val="en-US"/>
+        </w:rPr>
+      </w:pPr>
+      <w:r>
+        <w:rPr>
+          <w:lang w:val="en-US"/>
+        </w:rPr>
+        <w:t>)</w:t>
       </w:r>
     </w:p>
     <w:p>
       <w:pPr>
         <w:spacing w:line="168" w:lineRule="auto"/>
         <w:rPr>
-          <w:lang w:val="fr-FR"/>
+          <w:lang w:val="en-US"/>
         </w:rPr>
       </w:pPr>
     </w:p>
@@ -1219,25 +1497,19 @@
           <w:lang w:val="en-US"/>
         </w:rPr>
       </w:pPr>
-      <w:r>
-        <w:rPr>
-          <w:lang w:val="en-US"/>
-        </w:rPr>
-        <w:t xml:space="preserve">## </w:t>
-      </w:r>
-      <w:proofErr w:type="spellStart"/>
-      <w:r>
-        <w:rPr>
-          <w:lang w:val="en-US"/>
-        </w:rPr>
-        <w:t>Specifiying</w:t>
-      </w:r>
-      <w:proofErr w:type="spellEnd"/>
-      <w:r>
-        <w:rPr>
-          <w:lang w:val="en-US"/>
-        </w:rPr>
-        <w:t xml:space="preserve"> parameters and noise level</w:t>
+      <w:proofErr w:type="spellStart"/>
+      <w:r>
+        <w:rPr>
+          <w:lang w:val="en-US"/>
+        </w:rPr>
+        <w:t>outlier.prob</w:t>
+      </w:r>
+      <w:proofErr w:type="spellEnd"/>
+      <w:r>
+        <w:rPr>
+          <w:lang w:val="en-US"/>
+        </w:rPr>
+        <w:t xml:space="preserve"> &lt;- 1 / 2 # individual probability of having exactly one outlier observation</w:t>
       </w:r>
     </w:p>
     <w:p>
@@ -1247,25 +1519,279 @@
           <w:lang w:val="en-US"/>
         </w:rPr>
       </w:pPr>
-      <w:r>
-        <w:rPr>
-          <w:lang w:val="en-US"/>
-        </w:rPr>
-        <w:t xml:space="preserve">times &lt;- </w:t>
-      </w:r>
-      <w:proofErr w:type="gramStart"/>
-      <w:r>
-        <w:rPr>
-          <w:lang w:val="en-US"/>
-        </w:rPr>
-        <w:t>list(</w:t>
-      </w:r>
-      <w:proofErr w:type="gramEnd"/>
-      <w:r>
-        <w:rPr>
-          <w:lang w:val="en-US"/>
-        </w:rPr>
-        <w:t>"value" = 20, "</w:t>
+      <w:proofErr w:type="spellStart"/>
+      <w:r>
+        <w:rPr>
+          <w:lang w:val="en-US"/>
+        </w:rPr>
+        <w:t>na.prob</w:t>
+      </w:r>
+      <w:proofErr w:type="spellEnd"/>
+      <w:r>
+        <w:rPr>
+          <w:lang w:val="en-US"/>
+        </w:rPr>
+        <w:t xml:space="preserve"> &lt;- 1 / 10 # measurement probability to be missing</w:t>
+      </w:r>
+    </w:p>
+    <w:p>
+      <w:pPr>
+        <w:spacing w:line="168" w:lineRule="auto"/>
+        <w:rPr>
+          <w:lang w:val="en-US"/>
+        </w:rPr>
+      </w:pPr>
+      <w:proofErr w:type="spellStart"/>
+      <w:r>
+        <w:rPr>
+          <w:lang w:val="en-US"/>
+        </w:rPr>
+        <w:t>n.trail</w:t>
+      </w:r>
+      <w:proofErr w:type="spellEnd"/>
+      <w:r>
+        <w:rPr>
+          <w:lang w:val="en-US"/>
+        </w:rPr>
+        <w:t xml:space="preserve"> &lt;- 2L # </w:t>
+      </w:r>
+      <w:proofErr w:type="spellStart"/>
+      <w:r>
+        <w:rPr>
+          <w:lang w:val="en-US"/>
+        </w:rPr>
+        <w:t>nb</w:t>
+      </w:r>
+      <w:proofErr w:type="spellEnd"/>
+      <w:r>
+        <w:rPr>
+          <w:lang w:val="en-US"/>
+        </w:rPr>
+        <w:t xml:space="preserve"> of trailing observations (default is -1)</w:t>
+      </w:r>
+    </w:p>
+    <w:p>
+      <w:pPr>
+        <w:spacing w:line="168" w:lineRule="auto"/>
+        <w:rPr>
+          <w:lang w:val="en-US"/>
+        </w:rPr>
+      </w:pPr>
+      <w:proofErr w:type="spellStart"/>
+      <w:r>
+        <w:rPr>
+          <w:lang w:val="en-US"/>
+        </w:rPr>
+        <w:t>break.min.dist</w:t>
+      </w:r>
+      <w:proofErr w:type="spellEnd"/>
+      <w:r>
+        <w:rPr>
+          <w:lang w:val="en-US"/>
+        </w:rPr>
+        <w:t xml:space="preserve"> &lt;- list(x = 45, y = 0) # min between-breakpoints distance</w:t>
+      </w:r>
+    </w:p>
+    <w:p>
+      <w:pPr>
+        <w:spacing w:line="168" w:lineRule="auto"/>
+        <w:rPr>
+          <w:lang w:val="en-US"/>
+        </w:rPr>
+      </w:pPr>
+    </w:p>
+    <w:p>
+      <w:pPr>
+        <w:spacing w:line="168" w:lineRule="auto"/>
+        <w:rPr>
+          <w:lang w:val="en-US"/>
+        </w:rPr>
+      </w:pPr>
+      <w:proofErr w:type="spellStart"/>
+      <w:r>
+        <w:rPr>
+          <w:lang w:val="en-US"/>
+        </w:rPr>
+        <w:t>n.obs</w:t>
+      </w:r>
+      <w:proofErr w:type="spellEnd"/>
+      <w:r>
+        <w:rPr>
+          <w:lang w:val="en-US"/>
+        </w:rPr>
+        <w:t xml:space="preserve"> &lt;- 6L # </w:t>
+      </w:r>
+      <w:proofErr w:type="spellStart"/>
+      <w:r>
+        <w:rPr>
+          <w:lang w:val="en-US"/>
+        </w:rPr>
+        <w:t>nb</w:t>
+      </w:r>
+      <w:proofErr w:type="spellEnd"/>
+      <w:r>
+        <w:rPr>
+          <w:lang w:val="en-US"/>
+        </w:rPr>
+        <w:t xml:space="preserve"> of patients</w:t>
+      </w:r>
+    </w:p>
+    <w:p>
+      <w:pPr>
+        <w:spacing w:line="168" w:lineRule="auto"/>
+        <w:rPr>
+          <w:lang w:val="en-US"/>
+        </w:rPr>
+      </w:pPr>
+      <w:r>
+        <w:rPr>
+          <w:lang w:val="en-US"/>
+        </w:rPr>
+        <w:t>score.sd &lt;- .5</w:t>
+      </w:r>
+    </w:p>
+    <w:p>
+      <w:pPr>
+        <w:spacing w:line="168" w:lineRule="auto"/>
+        <w:rPr>
+          <w:lang w:val="en-US"/>
+        </w:rPr>
+      </w:pPr>
+    </w:p>
+    <w:p>
+      <w:pPr>
+        <w:spacing w:line="168" w:lineRule="auto"/>
+        <w:rPr>
+          <w:lang w:val="en-US"/>
+        </w:rPr>
+      </w:pPr>
+      <w:proofErr w:type="spellStart"/>
+      <w:r>
+        <w:rPr>
+          <w:lang w:val="en-US"/>
+        </w:rPr>
+        <w:t>true.traj</w:t>
+      </w:r>
+      <w:proofErr w:type="spellEnd"/>
+      <w:r>
+        <w:rPr>
+          <w:lang w:val="en-US"/>
+        </w:rPr>
+        <w:t xml:space="preserve"> &lt;- </w:t>
+      </w:r>
+      <w:proofErr w:type="spellStart"/>
+      <w:r>
+        <w:rPr>
+          <w:lang w:val="en-US"/>
+        </w:rPr>
+        <w:t>trueTraj</w:t>
+      </w:r>
+      <w:proofErr w:type="spellEnd"/>
+      <w:r>
+        <w:rPr>
+          <w:lang w:val="en-US"/>
+        </w:rPr>
+        <w:t>(times[["value"]], break.3[1:3])</w:t>
+      </w:r>
+    </w:p>
+    <w:p>
+      <w:pPr>
+        <w:spacing w:line="168" w:lineRule="auto"/>
+        <w:rPr>
+          <w:lang w:val="en-US"/>
+        </w:rPr>
+      </w:pPr>
+      <w:r>
+        <w:rPr>
+          <w:lang w:val="en-US"/>
+        </w:rPr>
+        <w:t>plot(</w:t>
+      </w:r>
+      <w:proofErr w:type="spellStart"/>
+      <w:r>
+        <w:rPr>
+          <w:lang w:val="en-US"/>
+        </w:rPr>
+        <w:t>true.traj</w:t>
+      </w:r>
+      <w:proofErr w:type="spellEnd"/>
+      <w:r>
+        <w:rPr>
+          <w:lang w:val="en-US"/>
+        </w:rPr>
+        <w:t>)</w:t>
+      </w:r>
+    </w:p>
+    <w:p>
+      <w:pPr>
+        <w:spacing w:line="168" w:lineRule="auto"/>
+        <w:rPr>
+          <w:lang w:val="en-US"/>
+        </w:rPr>
+      </w:pPr>
+    </w:p>
+    <w:p>
+      <w:pPr>
+        <w:spacing w:line="168" w:lineRule="auto"/>
+        <w:rPr>
+          <w:lang w:val="en-US"/>
+        </w:rPr>
+      </w:pPr>
+      <w:proofErr w:type="spellStart"/>
+      <w:r>
+        <w:rPr>
+          <w:lang w:val="en-US"/>
+        </w:rPr>
+        <w:t>sim.data</w:t>
+      </w:r>
+      <w:proofErr w:type="spellEnd"/>
+      <w:r>
+        <w:rPr>
+          <w:lang w:val="en-US"/>
+        </w:rPr>
+        <w:t xml:space="preserve"> &lt;- </w:t>
+      </w:r>
+      <w:proofErr w:type="spellStart"/>
+      <w:r>
+        <w:rPr>
+          <w:lang w:val="en-US"/>
+        </w:rPr>
+        <w:t>noiseTraj</w:t>
+      </w:r>
+      <w:proofErr w:type="spellEnd"/>
+      <w:r>
+        <w:rPr>
+          <w:lang w:val="en-US"/>
+        </w:rPr>
+        <w:t>(</w:t>
+      </w:r>
+      <w:proofErr w:type="spellStart"/>
+      <w:r>
+        <w:rPr>
+          <w:lang w:val="en-US"/>
+        </w:rPr>
+        <w:t>true.traj</w:t>
+      </w:r>
+      <w:proofErr w:type="spellEnd"/>
+      <w:r>
+        <w:rPr>
+          <w:lang w:val="en-US"/>
+        </w:rPr>
+        <w:t xml:space="preserve">, </w:t>
+      </w:r>
+      <w:proofErr w:type="spellStart"/>
+      <w:r>
+        <w:rPr>
+          <w:lang w:val="en-US"/>
+        </w:rPr>
+        <w:t>n.obs</w:t>
+      </w:r>
+      <w:proofErr w:type="spellEnd"/>
+      <w:r>
+        <w:rPr>
+          <w:lang w:val="en-US"/>
+        </w:rPr>
+        <w:t>, score.sd, times.sd = times[["</w:t>
       </w:r>
       <w:proofErr w:type="spellStart"/>
       <w:r>
@@ -1279,7 +1805,7 @@
         <w:rPr>
           <w:lang w:val="en-US"/>
         </w:rPr>
-        <w:t>" = 2)</w:t>
+        <w:t>"]],</w:t>
       </w:r>
     </w:p>
     <w:p>
@@ -1293,23 +1819,21 @@
         <w:rPr>
           <w:lang w:val="en-US"/>
         </w:rPr>
-        <w:t xml:space="preserve">break.3 &lt;- </w:t>
-      </w:r>
-      <w:proofErr w:type="spellStart"/>
-      <w:proofErr w:type="gramStart"/>
-      <w:r>
-        <w:rPr>
-          <w:lang w:val="en-US"/>
-        </w:rPr>
-        <w:t>data.frame</w:t>
-      </w:r>
-      <w:proofErr w:type="spellEnd"/>
-      <w:proofErr w:type="gramEnd"/>
-      <w:r>
-        <w:rPr>
-          <w:lang w:val="en-US"/>
-        </w:rPr>
-        <w:t>(</w:t>
+        <w:t xml:space="preserve">                      breakpoints.sd = break.3[4:5], </w:t>
+      </w:r>
+      <w:proofErr w:type="spellStart"/>
+      <w:r>
+        <w:rPr>
+          <w:lang w:val="en-US"/>
+        </w:rPr>
+        <w:t>break.x.dist</w:t>
+      </w:r>
+      <w:proofErr w:type="spellEnd"/>
+      <w:r>
+        <w:rPr>
+          <w:lang w:val="en-US"/>
+        </w:rPr>
+        <w:t xml:space="preserve"> = 20,</w:t>
       </w:r>
     </w:p>
     <w:p>
@@ -1323,42 +1847,14 @@
         <w:rPr>
           <w:lang w:val="en-US"/>
         </w:rPr>
-        <w:t xml:space="preserve">  pattern = </w:t>
-      </w:r>
-      <w:proofErr w:type="gramStart"/>
-      <w:r>
-        <w:rPr>
-          <w:lang w:val="en-US"/>
-        </w:rPr>
-        <w:t>c(</w:t>
-      </w:r>
-      <w:proofErr w:type="gramEnd"/>
-      <w:r>
-        <w:rPr>
-          <w:lang w:val="en-US"/>
-        </w:rPr>
-        <w:t>1, 1, NA),</w:t>
-      </w:r>
-    </w:p>
-    <w:p>
-      <w:pPr>
-        <w:spacing w:line="168" w:lineRule="auto"/>
-        <w:rPr>
-          <w:lang w:val="en-US"/>
-        </w:rPr>
-      </w:pPr>
-      <w:r>
-        <w:rPr>
-          <w:lang w:val="en-US"/>
-        </w:rPr>
-        <w:t xml:space="preserve">  </w:t>
-      </w:r>
-      <w:proofErr w:type="spellStart"/>
-      <w:r>
-        <w:rPr>
-          <w:lang w:val="en-US"/>
-        </w:rPr>
-        <w:t>bp.x</w:t>
+        <w:t xml:space="preserve">                      </w:t>
+      </w:r>
+      <w:proofErr w:type="spellStart"/>
+      <w:r>
+        <w:rPr>
+          <w:lang w:val="en-US"/>
+        </w:rPr>
+        <w:t>outlier.prob</w:t>
       </w:r>
       <w:proofErr w:type="spellEnd"/>
       <w:r>
@@ -1367,238 +1863,35 @@
         </w:rPr>
         <w:t xml:space="preserve"> = </w:t>
       </w:r>
-      <w:proofErr w:type="gramStart"/>
-      <w:r>
-        <w:rPr>
-          <w:lang w:val="en-US"/>
-        </w:rPr>
-        <w:t>c(</w:t>
-      </w:r>
-      <w:proofErr w:type="gramEnd"/>
-      <w:r>
-        <w:rPr>
-          <w:lang w:val="en-US"/>
-        </w:rPr>
-        <w:t>0, 180, 300</w:t>
-      </w:r>
-      <w:proofErr w:type="gramStart"/>
-      <w:r>
-        <w:rPr>
-          <w:lang w:val="en-US"/>
-        </w:rPr>
-        <w:t xml:space="preserve">),   </w:t>
-      </w:r>
-      <w:proofErr w:type="gramEnd"/>
-      <w:r>
-        <w:rPr>
-          <w:lang w:val="en-US"/>
-        </w:rPr>
-        <w:t xml:space="preserve"> # psi, time coordinate of breakpoints</w:t>
-      </w:r>
-    </w:p>
-    <w:p>
-      <w:pPr>
-        <w:spacing w:line="168" w:lineRule="auto"/>
-        <w:rPr>
-          <w:lang w:val="en-US"/>
-        </w:rPr>
-      </w:pPr>
-      <w:r>
-        <w:rPr>
-          <w:lang w:val="en-US"/>
-        </w:rPr>
-        <w:t xml:space="preserve">  </w:t>
-      </w:r>
-      <w:proofErr w:type="spellStart"/>
-      <w:proofErr w:type="gramStart"/>
-      <w:r>
-        <w:rPr>
-          <w:lang w:val="en-US"/>
-        </w:rPr>
-        <w:t>bp.y</w:t>
-      </w:r>
-      <w:proofErr w:type="spellEnd"/>
-      <w:proofErr w:type="gramEnd"/>
+      <w:proofErr w:type="spellStart"/>
+      <w:r>
+        <w:rPr>
+          <w:lang w:val="en-US"/>
+        </w:rPr>
+        <w:t>outlier.prob</w:t>
+      </w:r>
+      <w:proofErr w:type="spellEnd"/>
+      <w:r>
+        <w:rPr>
+          <w:lang w:val="en-US"/>
+        </w:rPr>
+        <w:t xml:space="preserve">, </w:t>
+      </w:r>
+      <w:proofErr w:type="spellStart"/>
+      <w:r>
+        <w:rPr>
+          <w:lang w:val="en-US"/>
+        </w:rPr>
+        <w:t>na.prob</w:t>
+      </w:r>
+      <w:proofErr w:type="spellEnd"/>
       <w:r>
         <w:rPr>
           <w:lang w:val="en-US"/>
         </w:rPr>
         <w:t xml:space="preserve"> = </w:t>
       </w:r>
-      <w:proofErr w:type="gramStart"/>
-      <w:r>
-        <w:rPr>
-          <w:lang w:val="en-US"/>
-        </w:rPr>
-        <w:t>c(</w:t>
-      </w:r>
-      <w:proofErr w:type="gramEnd"/>
-      <w:r>
-        <w:rPr>
-          <w:lang w:val="en-US"/>
-        </w:rPr>
-        <w:t>0, 9.5, 1</w:t>
-      </w:r>
-      <w:proofErr w:type="gramStart"/>
-      <w:r>
-        <w:rPr>
-          <w:lang w:val="en-US"/>
-        </w:rPr>
-        <w:t xml:space="preserve">),   </w:t>
-      </w:r>
-      <w:proofErr w:type="gramEnd"/>
-      <w:r>
-        <w:rPr>
-          <w:lang w:val="en-US"/>
-        </w:rPr>
-        <w:t xml:space="preserve">   # height of breakpoints</w:t>
-      </w:r>
-    </w:p>
-    <w:p>
-      <w:pPr>
-        <w:spacing w:line="168" w:lineRule="auto"/>
-        <w:rPr>
-          <w:lang w:val="fr-FR"/>
-        </w:rPr>
-      </w:pPr>
-      <w:r>
-        <w:rPr>
-          <w:lang w:val="en-US"/>
-        </w:rPr>
-        <w:t xml:space="preserve">  </w:t>
-      </w:r>
-      <w:r>
-        <w:rPr>
-          <w:lang w:val="fr-FR"/>
-        </w:rPr>
-        <w:t xml:space="preserve">bp.x.sd = </w:t>
-      </w:r>
-      <w:proofErr w:type="gramStart"/>
-      <w:r>
-        <w:rPr>
-          <w:lang w:val="fr-FR"/>
-        </w:rPr>
-        <w:t>c(</w:t>
-      </w:r>
-      <w:proofErr w:type="gramEnd"/>
-      <w:r>
-        <w:rPr>
-          <w:lang w:val="fr-FR"/>
-        </w:rPr>
-        <w:t>0, 50, 50</w:t>
-      </w:r>
-      <w:proofErr w:type="gramStart"/>
-      <w:r>
-        <w:rPr>
-          <w:lang w:val="fr-FR"/>
-        </w:rPr>
-        <w:t xml:space="preserve">),   </w:t>
-      </w:r>
-      <w:proofErr w:type="gramEnd"/>
-      <w:r>
-        <w:rPr>
-          <w:lang w:val="fr-FR"/>
-        </w:rPr>
-        <w:t xml:space="preserve"># noise </w:t>
-      </w:r>
-      <w:proofErr w:type="spellStart"/>
-      <w:r>
-        <w:rPr>
-          <w:lang w:val="fr-FR"/>
-        </w:rPr>
-        <w:t>levels</w:t>
-      </w:r>
-      <w:proofErr w:type="spellEnd"/>
-    </w:p>
-    <w:p>
-      <w:pPr>
-        <w:spacing w:line="168" w:lineRule="auto"/>
-        <w:rPr>
-          <w:lang w:val="en-US"/>
-        </w:rPr>
-      </w:pPr>
-      <w:r>
-        <w:rPr>
-          <w:lang w:val="fr-FR"/>
-        </w:rPr>
-        <w:t xml:space="preserve">  </w:t>
-      </w:r>
-      <w:r>
-        <w:rPr>
-          <w:lang w:val="en-US"/>
-        </w:rPr>
-        <w:t xml:space="preserve">bp.y.sd = </w:t>
-      </w:r>
-      <w:proofErr w:type="gramStart"/>
-      <w:r>
-        <w:rPr>
-          <w:lang w:val="en-US"/>
-        </w:rPr>
-        <w:t>c(</w:t>
-      </w:r>
-      <w:proofErr w:type="gramEnd"/>
-      <w:r>
-        <w:rPr>
-          <w:lang w:val="en-US"/>
-        </w:rPr>
-        <w:t>0, 1, 1)</w:t>
-      </w:r>
-    </w:p>
-    <w:p>
-      <w:pPr>
-        <w:spacing w:line="168" w:lineRule="auto"/>
-        <w:rPr>
-          <w:lang w:val="en-US"/>
-        </w:rPr>
-      </w:pPr>
-      <w:r>
-        <w:rPr>
-          <w:lang w:val="en-US"/>
-        </w:rPr>
-        <w:t>)</w:t>
-      </w:r>
-    </w:p>
-    <w:p>
-      <w:pPr>
-        <w:spacing w:line="168" w:lineRule="auto"/>
-        <w:rPr>
-          <w:lang w:val="en-US"/>
-        </w:rPr>
-      </w:pPr>
-    </w:p>
-    <w:p>
-      <w:pPr>
-        <w:spacing w:line="168" w:lineRule="auto"/>
-        <w:rPr>
-          <w:lang w:val="en-US"/>
-        </w:rPr>
-      </w:pPr>
-      <w:proofErr w:type="spellStart"/>
-      <w:proofErr w:type="gramStart"/>
-      <w:r>
-        <w:rPr>
-          <w:lang w:val="en-US"/>
-        </w:rPr>
-        <w:t>outlier.prob</w:t>
-      </w:r>
-      <w:proofErr w:type="spellEnd"/>
-      <w:proofErr w:type="gramEnd"/>
-      <w:r>
-        <w:rPr>
-          <w:lang w:val="en-US"/>
-        </w:rPr>
-        <w:t xml:space="preserve"> &lt;- 1 / 2 # individual probability of having exactly one outlier observation</w:t>
-      </w:r>
-    </w:p>
-    <w:p>
-      <w:pPr>
-        <w:spacing w:line="168" w:lineRule="auto"/>
-        <w:rPr>
-          <w:lang w:val="en-US"/>
-        </w:rPr>
-      </w:pPr>
-      <w:proofErr w:type="spellStart"/>
-      <w:proofErr w:type="gramStart"/>
+      <w:proofErr w:type="spellStart"/>
       <w:r>
         <w:rPr>
           <w:lang w:val="en-US"/>
@@ -1606,23 +1899,13 @@
         <w:t>na.prob</w:t>
       </w:r>
       <w:proofErr w:type="spellEnd"/>
-      <w:proofErr w:type="gramEnd"/>
-      <w:r>
-        <w:rPr>
-          <w:lang w:val="en-US"/>
-        </w:rPr>
-        <w:t xml:space="preserve"> &lt;- 1 / 10 # measurement probability to be missing</w:t>
-      </w:r>
-    </w:p>
-    <w:p>
-      <w:pPr>
-        <w:spacing w:line="168" w:lineRule="auto"/>
-        <w:rPr>
-          <w:lang w:val="en-US"/>
-        </w:rPr>
-      </w:pPr>
-      <w:proofErr w:type="spellStart"/>
-      <w:proofErr w:type="gramStart"/>
+      <w:r>
+        <w:rPr>
+          <w:lang w:val="en-US"/>
+        </w:rPr>
+        <w:t xml:space="preserve">, </w:t>
+      </w:r>
+      <w:proofErr w:type="spellStart"/>
       <w:r>
         <w:rPr>
           <w:lang w:val="en-US"/>
@@ -1630,347 +1913,6 @@
         <w:t>n.trail</w:t>
       </w:r>
       <w:proofErr w:type="spellEnd"/>
-      <w:proofErr w:type="gramEnd"/>
-      <w:r>
-        <w:rPr>
-          <w:lang w:val="en-US"/>
-        </w:rPr>
-        <w:t xml:space="preserve"> &lt;- 2L # </w:t>
-      </w:r>
-      <w:proofErr w:type="spellStart"/>
-      <w:r>
-        <w:rPr>
-          <w:lang w:val="en-US"/>
-        </w:rPr>
-        <w:t>nb</w:t>
-      </w:r>
-      <w:proofErr w:type="spellEnd"/>
-      <w:r>
-        <w:rPr>
-          <w:lang w:val="en-US"/>
-        </w:rPr>
-        <w:t xml:space="preserve"> of trailing observations (default is -1)</w:t>
-      </w:r>
-    </w:p>
-    <w:p>
-      <w:pPr>
-        <w:spacing w:line="168" w:lineRule="auto"/>
-        <w:rPr>
-          <w:lang w:val="en-US"/>
-        </w:rPr>
-      </w:pPr>
-      <w:proofErr w:type="spellStart"/>
-      <w:proofErr w:type="gramStart"/>
-      <w:r>
-        <w:rPr>
-          <w:lang w:val="en-US"/>
-        </w:rPr>
-        <w:t>break.min.dist</w:t>
-      </w:r>
-      <w:proofErr w:type="spellEnd"/>
-      <w:proofErr w:type="gramEnd"/>
-      <w:r>
-        <w:rPr>
-          <w:lang w:val="en-US"/>
-        </w:rPr>
-        <w:t xml:space="preserve"> &lt;- </w:t>
-      </w:r>
-      <w:proofErr w:type="gramStart"/>
-      <w:r>
-        <w:rPr>
-          <w:lang w:val="en-US"/>
-        </w:rPr>
-        <w:t>list(</w:t>
-      </w:r>
-      <w:proofErr w:type="gramEnd"/>
-      <w:r>
-        <w:rPr>
-          <w:lang w:val="en-US"/>
-        </w:rPr>
-        <w:t>x = 45, y = 0) # min between-breakpoints distance</w:t>
-      </w:r>
-    </w:p>
-    <w:p>
-      <w:pPr>
-        <w:spacing w:line="168" w:lineRule="auto"/>
-        <w:rPr>
-          <w:lang w:val="en-US"/>
-        </w:rPr>
-      </w:pPr>
-    </w:p>
-    <w:p>
-      <w:pPr>
-        <w:spacing w:line="168" w:lineRule="auto"/>
-        <w:rPr>
-          <w:lang w:val="en-US"/>
-        </w:rPr>
-      </w:pPr>
-      <w:proofErr w:type="spellStart"/>
-      <w:r>
-        <w:rPr>
-          <w:lang w:val="en-US"/>
-        </w:rPr>
-        <w:t>n.obs</w:t>
-      </w:r>
-      <w:proofErr w:type="spellEnd"/>
-      <w:r>
-        <w:rPr>
-          <w:lang w:val="en-US"/>
-        </w:rPr>
-        <w:t xml:space="preserve"> &lt;- 6L # </w:t>
-      </w:r>
-      <w:proofErr w:type="spellStart"/>
-      <w:r>
-        <w:rPr>
-          <w:lang w:val="en-US"/>
-        </w:rPr>
-        <w:t>nb</w:t>
-      </w:r>
-      <w:proofErr w:type="spellEnd"/>
-      <w:r>
-        <w:rPr>
-          <w:lang w:val="en-US"/>
-        </w:rPr>
-        <w:t xml:space="preserve"> of patients</w:t>
-      </w:r>
-    </w:p>
-    <w:p>
-      <w:pPr>
-        <w:spacing w:line="168" w:lineRule="auto"/>
-        <w:rPr>
-          <w:lang w:val="en-US"/>
-        </w:rPr>
-      </w:pPr>
-      <w:r>
-        <w:rPr>
-          <w:lang w:val="en-US"/>
-        </w:rPr>
-        <w:t>score.sd &lt;- .5</w:t>
-      </w:r>
-    </w:p>
-    <w:p>
-      <w:pPr>
-        <w:spacing w:line="168" w:lineRule="auto"/>
-        <w:rPr>
-          <w:lang w:val="en-US"/>
-        </w:rPr>
-      </w:pPr>
-    </w:p>
-    <w:p>
-      <w:pPr>
-        <w:spacing w:line="168" w:lineRule="auto"/>
-        <w:rPr>
-          <w:lang w:val="en-US"/>
-        </w:rPr>
-      </w:pPr>
-      <w:proofErr w:type="spellStart"/>
-      <w:proofErr w:type="gramStart"/>
-      <w:r>
-        <w:rPr>
-          <w:lang w:val="en-US"/>
-        </w:rPr>
-        <w:t>true.traj</w:t>
-      </w:r>
-      <w:proofErr w:type="spellEnd"/>
-      <w:proofErr w:type="gramEnd"/>
-      <w:r>
-        <w:rPr>
-          <w:lang w:val="en-US"/>
-        </w:rPr>
-        <w:t xml:space="preserve"> &lt;- </w:t>
-      </w:r>
-      <w:proofErr w:type="spellStart"/>
-      <w:r>
-        <w:rPr>
-          <w:lang w:val="en-US"/>
-        </w:rPr>
-        <w:t>trueTraj</w:t>
-      </w:r>
-      <w:proofErr w:type="spellEnd"/>
-      <w:r>
-        <w:rPr>
-          <w:lang w:val="en-US"/>
-        </w:rPr>
-        <w:t>(times[["value"]], break.3[1:3])</w:t>
-      </w:r>
-    </w:p>
-    <w:p>
-      <w:pPr>
-        <w:spacing w:line="168" w:lineRule="auto"/>
-        <w:rPr>
-          <w:lang w:val="en-US"/>
-        </w:rPr>
-      </w:pPr>
-      <w:r>
-        <w:rPr>
-          <w:lang w:val="en-US"/>
-        </w:rPr>
-        <w:t>plot(</w:t>
-      </w:r>
-      <w:proofErr w:type="spellStart"/>
-      <w:proofErr w:type="gramStart"/>
-      <w:r>
-        <w:rPr>
-          <w:lang w:val="en-US"/>
-        </w:rPr>
-        <w:t>true.traj</w:t>
-      </w:r>
-      <w:proofErr w:type="spellEnd"/>
-      <w:proofErr w:type="gramEnd"/>
-      <w:r>
-        <w:rPr>
-          <w:lang w:val="en-US"/>
-        </w:rPr>
-        <w:t>)</w:t>
-      </w:r>
-    </w:p>
-    <w:p>
-      <w:pPr>
-        <w:spacing w:line="168" w:lineRule="auto"/>
-        <w:rPr>
-          <w:lang w:val="en-US"/>
-        </w:rPr>
-      </w:pPr>
-    </w:p>
-    <w:p>
-      <w:pPr>
-        <w:spacing w:line="168" w:lineRule="auto"/>
-        <w:rPr>
-          <w:lang w:val="en-US"/>
-        </w:rPr>
-      </w:pPr>
-      <w:proofErr w:type="spellStart"/>
-      <w:r>
-        <w:rPr>
-          <w:lang w:val="en-US"/>
-        </w:rPr>
-        <w:t>sim.data</w:t>
-      </w:r>
-      <w:proofErr w:type="spellEnd"/>
-      <w:r>
-        <w:rPr>
-          <w:lang w:val="en-US"/>
-        </w:rPr>
-        <w:t xml:space="preserve"> &lt;- </w:t>
-      </w:r>
-      <w:proofErr w:type="spellStart"/>
-      <w:proofErr w:type="gramStart"/>
-      <w:r>
-        <w:rPr>
-          <w:lang w:val="en-US"/>
-        </w:rPr>
-        <w:t>noiseTraj</w:t>
-      </w:r>
-      <w:proofErr w:type="spellEnd"/>
-      <w:r>
-        <w:rPr>
-          <w:lang w:val="en-US"/>
-        </w:rPr>
-        <w:t>(</w:t>
-      </w:r>
-      <w:proofErr w:type="spellStart"/>
-      <w:r>
-        <w:rPr>
-          <w:lang w:val="en-US"/>
-        </w:rPr>
-        <w:t>true.traj</w:t>
-      </w:r>
-      <w:proofErr w:type="spellEnd"/>
-      <w:proofErr w:type="gramEnd"/>
-      <w:r>
-        <w:rPr>
-          <w:lang w:val="en-US"/>
-        </w:rPr>
-        <w:t xml:space="preserve">, </w:t>
-      </w:r>
-      <w:proofErr w:type="spellStart"/>
-      <w:r>
-        <w:rPr>
-          <w:lang w:val="en-US"/>
-        </w:rPr>
-        <w:t>n.obs</w:t>
-      </w:r>
-      <w:proofErr w:type="spellEnd"/>
-      <w:r>
-        <w:rPr>
-          <w:lang w:val="en-US"/>
-        </w:rPr>
-        <w:t>, score.sd, times.sd = times[["</w:t>
-      </w:r>
-      <w:proofErr w:type="spellStart"/>
-      <w:r>
-        <w:rPr>
-          <w:lang w:val="en-US"/>
-        </w:rPr>
-        <w:t>sd</w:t>
-      </w:r>
-      <w:proofErr w:type="spellEnd"/>
-      <w:r>
-        <w:rPr>
-          <w:lang w:val="en-US"/>
-        </w:rPr>
-        <w:t>"]],</w:t>
-      </w:r>
-    </w:p>
-    <w:p>
-      <w:pPr>
-        <w:spacing w:line="168" w:lineRule="auto"/>
-        <w:rPr>
-          <w:lang w:val="en-US"/>
-        </w:rPr>
-      </w:pPr>
-      <w:r>
-        <w:rPr>
-          <w:lang w:val="en-US"/>
-        </w:rPr>
-        <w:t xml:space="preserve">                      breakpoints.sd = break.3[4:5], </w:t>
-      </w:r>
-      <w:proofErr w:type="spellStart"/>
-      <w:r>
-        <w:rPr>
-          <w:lang w:val="en-US"/>
-        </w:rPr>
-        <w:t>break.</w:t>
-      </w:r>
-      <w:proofErr w:type="gramStart"/>
-      <w:r>
-        <w:rPr>
-          <w:lang w:val="en-US"/>
-        </w:rPr>
-        <w:t>x.dist</w:t>
-      </w:r>
-      <w:proofErr w:type="spellEnd"/>
-      <w:proofErr w:type="gramEnd"/>
-      <w:r>
-        <w:rPr>
-          <w:lang w:val="en-US"/>
-        </w:rPr>
-        <w:t xml:space="preserve"> = 20,</w:t>
-      </w:r>
-    </w:p>
-    <w:p>
-      <w:pPr>
-        <w:spacing w:line="168" w:lineRule="auto"/>
-        <w:rPr>
-          <w:lang w:val="en-US"/>
-        </w:rPr>
-      </w:pPr>
-      <w:r>
-        <w:rPr>
-          <w:lang w:val="en-US"/>
-        </w:rPr>
-        <w:t xml:space="preserve">                      </w:t>
-      </w:r>
-      <w:proofErr w:type="spellStart"/>
-      <w:proofErr w:type="gramStart"/>
-      <w:r>
-        <w:rPr>
-          <w:lang w:val="en-US"/>
-        </w:rPr>
-        <w:t>outlier.prob</w:t>
-      </w:r>
-      <w:proofErr w:type="spellEnd"/>
-      <w:proofErr w:type="gramEnd"/>
       <w:r>
         <w:rPr>
           <w:lang w:val="en-US"/>
@@ -1978,55 +1920,6 @@
         <w:t xml:space="preserve"> = </w:t>
       </w:r>
       <w:proofErr w:type="spellStart"/>
-      <w:proofErr w:type="gramStart"/>
-      <w:r>
-        <w:rPr>
-          <w:lang w:val="en-US"/>
-        </w:rPr>
-        <w:t>outlier.prob</w:t>
-      </w:r>
-      <w:proofErr w:type="spellEnd"/>
-      <w:proofErr w:type="gramEnd"/>
-      <w:r>
-        <w:rPr>
-          <w:lang w:val="en-US"/>
-        </w:rPr>
-        <w:t xml:space="preserve">, </w:t>
-      </w:r>
-      <w:proofErr w:type="spellStart"/>
-      <w:proofErr w:type="gramStart"/>
-      <w:r>
-        <w:rPr>
-          <w:lang w:val="en-US"/>
-        </w:rPr>
-        <w:t>na.prob</w:t>
-      </w:r>
-      <w:proofErr w:type="spellEnd"/>
-      <w:proofErr w:type="gramEnd"/>
-      <w:r>
-        <w:rPr>
-          <w:lang w:val="en-US"/>
-        </w:rPr>
-        <w:t xml:space="preserve"> = </w:t>
-      </w:r>
-      <w:proofErr w:type="spellStart"/>
-      <w:proofErr w:type="gramStart"/>
-      <w:r>
-        <w:rPr>
-          <w:lang w:val="en-US"/>
-        </w:rPr>
-        <w:t>na.prob</w:t>
-      </w:r>
-      <w:proofErr w:type="spellEnd"/>
-      <w:proofErr w:type="gramEnd"/>
-      <w:r>
-        <w:rPr>
-          <w:lang w:val="en-US"/>
-        </w:rPr>
-        <w:t xml:space="preserve">, </w:t>
-      </w:r>
-      <w:proofErr w:type="spellStart"/>
-      <w:proofErr w:type="gramStart"/>
       <w:r>
         <w:rPr>
           <w:lang w:val="en-US"/>
@@ -2034,23 +1927,6 @@
         <w:t>n.trail</w:t>
       </w:r>
       <w:proofErr w:type="spellEnd"/>
-      <w:proofErr w:type="gramEnd"/>
-      <w:r>
-        <w:rPr>
-          <w:lang w:val="en-US"/>
-        </w:rPr>
-        <w:t xml:space="preserve"> = </w:t>
-      </w:r>
-      <w:proofErr w:type="spellStart"/>
-      <w:proofErr w:type="gramStart"/>
-      <w:r>
-        <w:rPr>
-          <w:lang w:val="en-US"/>
-        </w:rPr>
-        <w:t>n.trail</w:t>
-      </w:r>
-      <w:proofErr w:type="spellEnd"/>
-      <w:proofErr w:type="gramEnd"/>
       <w:r>
         <w:rPr>
           <w:lang w:val="en-US"/>
@@ -2301,6 +2177,118 @@
     </w:lvl>
   </w:abstractNum>
   <w:abstractNum w:abstractNumId="2" w15:restartNumberingAfterBreak="0">
+    <w:nsid w:val="1F2D3B9C"/>
+    <w:multiLevelType w:val="hybridMultilevel"/>
+    <w:tmpl w:val="EEB06900"/>
+    <w:lvl w:ilvl="0" w:tplc="E1E83880">
+      <w:numFmt w:val="bullet"/>
+      <w:lvlText w:val="-"/>
+      <w:lvlJc w:val="left"/>
+      <w:pPr>
+        <w:ind w:left="720" w:hanging="360"/>
+      </w:pPr>
+      <w:rPr>
+        <w:rFonts w:ascii="Calibri" w:eastAsiaTheme="minorHAnsi" w:hAnsi="Calibri" w:cs="Calibri" w:hint="default"/>
+      </w:rPr>
+    </w:lvl>
+    <w:lvl w:ilvl="1" w:tplc="04060003">
+      <w:start w:val="1"/>
+      <w:numFmt w:val="bullet"/>
+      <w:lvlText w:val="o"/>
+      <w:lvlJc w:val="left"/>
+      <w:pPr>
+        <w:ind w:left="1440" w:hanging="360"/>
+      </w:pPr>
+      <w:rPr>
+        <w:rFonts w:ascii="Courier New" w:hAnsi="Courier New" w:cs="Courier New" w:hint="default"/>
+      </w:rPr>
+    </w:lvl>
+    <w:lvl w:ilvl="2" w:tplc="04060005" w:tentative="1">
+      <w:start w:val="1"/>
+      <w:numFmt w:val="bullet"/>
+      <w:lvlText w:val=""/>
+      <w:lvlJc w:val="left"/>
+      <w:pPr>
+        <w:ind w:left="2160" w:hanging="360"/>
+      </w:pPr>
+      <w:rPr>
+        <w:rFonts w:ascii="Wingdings" w:hAnsi="Wingdings" w:hint="default"/>
+      </w:rPr>
+    </w:lvl>
+    <w:lvl w:ilvl="3" w:tplc="04060001" w:tentative="1">
+      <w:start w:val="1"/>
+      <w:numFmt w:val="bullet"/>
+      <w:lvlText w:val=""/>
+      <w:lvlJc w:val="left"/>
+      <w:pPr>
+        <w:ind w:left="2880" w:hanging="360"/>
+      </w:pPr>
+      <w:rPr>
+        <w:rFonts w:ascii="Symbol" w:hAnsi="Symbol" w:hint="default"/>
+      </w:rPr>
+    </w:lvl>
+    <w:lvl w:ilvl="4" w:tplc="04060003" w:tentative="1">
+      <w:start w:val="1"/>
+      <w:numFmt w:val="bullet"/>
+      <w:lvlText w:val="o"/>
+      <w:lvlJc w:val="left"/>
+      <w:pPr>
+        <w:ind w:left="3600" w:hanging="360"/>
+      </w:pPr>
+      <w:rPr>
+        <w:rFonts w:ascii="Courier New" w:hAnsi="Courier New" w:cs="Courier New" w:hint="default"/>
+      </w:rPr>
+    </w:lvl>
+    <w:lvl w:ilvl="5" w:tplc="04060005" w:tentative="1">
+      <w:start w:val="1"/>
+      <w:numFmt w:val="bullet"/>
+      <w:lvlText w:val=""/>
+      <w:lvlJc w:val="left"/>
+      <w:pPr>
+        <w:ind w:left="4320" w:hanging="360"/>
+      </w:pPr>
+      <w:rPr>
+        <w:rFonts w:ascii="Wingdings" w:hAnsi="Wingdings" w:hint="default"/>
+      </w:rPr>
+    </w:lvl>
+    <w:lvl w:ilvl="6" w:tplc="04060001" w:tentative="1">
+      <w:start w:val="1"/>
+      <w:numFmt w:val="bullet"/>
+      <w:lvlText w:val=""/>
+      <w:lvlJc w:val="left"/>
+      <w:pPr>
+        <w:ind w:left="5040" w:hanging="360"/>
+      </w:pPr>
+      <w:rPr>
+        <w:rFonts w:ascii="Symbol" w:hAnsi="Symbol" w:hint="default"/>
+      </w:rPr>
+    </w:lvl>
+    <w:lvl w:ilvl="7" w:tplc="04060003" w:tentative="1">
+      <w:start w:val="1"/>
+      <w:numFmt w:val="bullet"/>
+      <w:lvlText w:val="o"/>
+      <w:lvlJc w:val="left"/>
+      <w:pPr>
+        <w:ind w:left="5760" w:hanging="360"/>
+      </w:pPr>
+      <w:rPr>
+        <w:rFonts w:ascii="Courier New" w:hAnsi="Courier New" w:cs="Courier New" w:hint="default"/>
+      </w:rPr>
+    </w:lvl>
+    <w:lvl w:ilvl="8" w:tplc="04060005" w:tentative="1">
+      <w:start w:val="1"/>
+      <w:numFmt w:val="bullet"/>
+      <w:lvlText w:val=""/>
+      <w:lvlJc w:val="left"/>
+      <w:pPr>
+        <w:ind w:left="6480" w:hanging="360"/>
+      </w:pPr>
+      <w:rPr>
+        <w:rFonts w:ascii="Wingdings" w:hAnsi="Wingdings" w:hint="default"/>
+      </w:rPr>
+    </w:lvl>
+  </w:abstractNum>
+  <w:abstractNum w:abstractNumId="3" w15:restartNumberingAfterBreak="0">
     <w:nsid w:val="73167392"/>
     <w:multiLevelType w:val="hybridMultilevel"/>
     <w:tmpl w:val="7CB475F8"/>
@@ -2417,10 +2405,13 @@
     <w:abstractNumId w:val="1"/>
   </w:num>
   <w:num w:numId="2" w16cid:durableId="1416172711">
-    <w:abstractNumId w:val="2"/>
+    <w:abstractNumId w:val="3"/>
   </w:num>
   <w:num w:numId="3" w16cid:durableId="262147668">
     <w:abstractNumId w:val="0"/>
+  </w:num>
+  <w:num w:numId="4" w16cid:durableId="600645626">
+    <w:abstractNumId w:val="2"/>
   </w:num>
 </w:numbering>
 </file>

</xml_diff>

<commit_message>
Extended descriptive graphs and docs
</commit_message>
<xml_diff>
--- a/inst/simSDI.docx
+++ b/inst/simSDI.docx
@@ -77,6 +77,7 @@
         <w:t>at the individual level, (</w:t>
       </w:r>
       <w:proofErr w:type="spellStart"/>
+      <w:proofErr w:type="gramStart"/>
       <w:r>
         <w:rPr>
           <w:lang w:val="en-US"/>
@@ -84,6 +85,7 @@
         <w:t>x,y</w:t>
       </w:r>
       <w:proofErr w:type="spellEnd"/>
+      <w:proofErr w:type="gramEnd"/>
       <w:r>
         <w:rPr>
           <w:lang w:val="en-US"/>
@@ -129,6 +131,96 @@
     </w:p>
     <w:p>
       <w:pPr>
+        <w:pStyle w:val="ListParagraph"/>
+        <w:numPr>
+          <w:ilvl w:val="0"/>
+          <w:numId w:val="4"/>
+        </w:numPr>
+        <w:rPr>
+          <w:lang w:val="en-US"/>
+        </w:rPr>
+      </w:pPr>
+      <w:r>
+        <w:rPr>
+          <w:lang w:val="en-US"/>
+        </w:rPr>
+        <w:t>After computing individuals’ breakpoints, when can derive the true individual trajectories (on a continuous 0-10 scale), from which we add (gaussian white) noise to derive the noised individual trajectories.</w:t>
+      </w:r>
+    </w:p>
+    <w:p>
+      <w:pPr>
+        <w:pStyle w:val="ListParagraph"/>
+        <w:numPr>
+          <w:ilvl w:val="0"/>
+          <w:numId w:val="4"/>
+        </w:numPr>
+        <w:rPr>
+          <w:lang w:val="en-US"/>
+        </w:rPr>
+      </w:pPr>
+      <w:r>
+        <w:rPr>
+          <w:lang w:val="en-US"/>
+        </w:rPr>
+        <w:t>Finally, the score is computed by rounding the noised trajectories to the closest integer in the range of the scale.</w:t>
+      </w:r>
+    </w:p>
+    <w:p>
+      <w:pPr>
+        <w:pStyle w:val="ListParagraph"/>
+        <w:numPr>
+          <w:ilvl w:val="0"/>
+          <w:numId w:val="4"/>
+        </w:numPr>
+        <w:rPr>
+          <w:lang w:val="en-US"/>
+        </w:rPr>
+      </w:pPr>
+      <w:r>
+        <w:rPr>
+          <w:lang w:val="en-US"/>
+        </w:rPr>
+        <w:t>One optional last step consists of adding:</w:t>
+      </w:r>
+    </w:p>
+    <w:p>
+      <w:pPr>
+        <w:pStyle w:val="ListParagraph"/>
+        <w:numPr>
+          <w:ilvl w:val="1"/>
+          <w:numId w:val="4"/>
+        </w:numPr>
+        <w:rPr>
+          <w:lang w:val="en-US"/>
+        </w:rPr>
+      </w:pPr>
+      <w:r>
+        <w:rPr>
+          <w:lang w:val="en-US"/>
+        </w:rPr>
+        <w:t>Outliers, at most one per patients, and simulated by a drop is measured score by 1-3 points with higher probability on higher drops</w:t>
+      </w:r>
+    </w:p>
+    <w:p>
+      <w:pPr>
+        <w:pStyle w:val="ListParagraph"/>
+        <w:numPr>
+          <w:ilvl w:val="1"/>
+          <w:numId w:val="4"/>
+        </w:numPr>
+        <w:rPr>
+          <w:lang w:val="en-US"/>
+        </w:rPr>
+      </w:pPr>
+      <w:r>
+        <w:rPr>
+          <w:lang w:val="en-US"/>
+        </w:rPr>
+        <w:t>Missing values (completely at random)</w:t>
+      </w:r>
+    </w:p>
+    <w:p>
+      <w:pPr>
         <w:rPr>
           <w:lang w:val="en-US"/>
         </w:rPr>
@@ -295,6 +387,7 @@
         <w:rPr>
           <w:noProof/>
         </w:rPr>
+        <w:lastRenderedPageBreak/>
         <w:drawing>
           <wp:inline distT="0" distB="0" distL="0" distR="0" wp14:anchorId="017DA6DF" wp14:editId="4D893977">
             <wp:extent cx="4733925" cy="3067139"/>
@@ -484,7 +577,6 @@
           <w:iCs/>
           <w:lang w:val="en-US"/>
         </w:rPr>
-        <w:lastRenderedPageBreak/>
         <w:t>times</w:t>
       </w:r>
       <w:r>
@@ -645,7 +737,21 @@
         <w:rPr>
           <w:lang w:val="en-US"/>
         </w:rPr>
-        <w:t xml:space="preserve"> for x axis, and normally distributed for y axis</w:t>
+        <w:t xml:space="preserve"> for x </w:t>
+      </w:r>
+      <w:proofErr w:type="gramStart"/>
+      <w:r>
+        <w:rPr>
+          <w:lang w:val="en-US"/>
+        </w:rPr>
+        <w:t>axis, and</w:t>
+      </w:r>
+      <w:proofErr w:type="gramEnd"/>
+      <w:r>
+        <w:rPr>
+          <w:lang w:val="en-US"/>
+        </w:rPr>
+        <w:t xml:space="preserve"> normally distributed for y axis</w:t>
       </w:r>
       <w:r>
         <w:rPr>
@@ -713,9 +819,19 @@
           <w:iCs/>
           <w:lang w:val="en-US"/>
         </w:rPr>
-        <w:t>break.x.dist</w:t>
-      </w:r>
-      <w:proofErr w:type="spellEnd"/>
+        <w:t>break.</w:t>
+      </w:r>
+      <w:proofErr w:type="gramStart"/>
+      <w:r>
+        <w:rPr>
+          <w:i/>
+          <w:iCs/>
+          <w:lang w:val="en-US"/>
+        </w:rPr>
+        <w:t>x.dist</w:t>
+      </w:r>
+      <w:proofErr w:type="spellEnd"/>
+      <w:proofErr w:type="gramEnd"/>
       <w:r>
         <w:rPr>
           <w:lang w:val="en-US"/>
@@ -749,6 +865,7 @@
         </w:rPr>
       </w:pPr>
       <w:proofErr w:type="spellStart"/>
+      <w:proofErr w:type="gramStart"/>
       <w:r>
         <w:rPr>
           <w:i/>
@@ -758,6 +875,7 @@
         <w:t>outlier.prob</w:t>
       </w:r>
       <w:proofErr w:type="spellEnd"/>
+      <w:proofErr w:type="gramEnd"/>
       <w:r>
         <w:rPr>
           <w:lang w:val="en-US"/>
@@ -779,6 +897,7 @@
         </w:rPr>
       </w:pPr>
       <w:proofErr w:type="spellStart"/>
+      <w:proofErr w:type="gramStart"/>
       <w:r>
         <w:rPr>
           <w:i/>
@@ -788,6 +907,7 @@
         <w:t>na.prob</w:t>
       </w:r>
       <w:proofErr w:type="spellEnd"/>
+      <w:proofErr w:type="gramEnd"/>
       <w:r>
         <w:rPr>
           <w:lang w:val="en-US"/>
@@ -809,6 +929,7 @@
         </w:rPr>
       </w:pPr>
       <w:proofErr w:type="spellStart"/>
+      <w:proofErr w:type="gramStart"/>
       <w:r>
         <w:rPr>
           <w:i/>
@@ -818,6 +939,7 @@
         <w:t>n.trail</w:t>
       </w:r>
       <w:proofErr w:type="spellEnd"/>
+      <w:proofErr w:type="gramEnd"/>
       <w:r>
         <w:rPr>
           <w:lang w:val="en-US"/>
@@ -840,6 +962,7 @@
         <w:rPr>
           <w:noProof/>
         </w:rPr>
+        <w:lastRenderedPageBreak/>
         <w:drawing>
           <wp:inline distT="0" distB="0" distL="0" distR="0" wp14:anchorId="6AFF8BC9" wp14:editId="36D250AA">
             <wp:extent cx="4400550" cy="2856993"/>
@@ -1019,7 +1142,6 @@
         <w:rPr>
           <w:lang w:val="en-US"/>
         </w:rPr>
-        <w:lastRenderedPageBreak/>
         <w:t>Default ‘plot’ represents the measurement with type (signal, outlier, trailing) along with true individual</w:t>
       </w:r>
       <w:r>
@@ -1152,18 +1274,26 @@
           <w:lang w:val="fr-FR"/>
         </w:rPr>
       </w:pPr>
+      <w:proofErr w:type="gramStart"/>
       <w:r>
         <w:rPr>
           <w:lang w:val="fr-FR"/>
         </w:rPr>
         <w:lastRenderedPageBreak/>
-        <w:t>source("R/</w:t>
-      </w:r>
-      <w:proofErr w:type="spellStart"/>
+        <w:t>source</w:t>
+      </w:r>
+      <w:proofErr w:type="gramEnd"/>
       <w:r>
         <w:rPr>
           <w:lang w:val="fr-FR"/>
         </w:rPr>
+        <w:t>("R/</w:t>
+      </w:r>
+      <w:proofErr w:type="spellStart"/>
+      <w:r>
+        <w:rPr>
+          <w:lang w:val="fr-FR"/>
+        </w:rPr>
         <w:t>trueTraj.R</w:t>
       </w:r>
       <w:proofErr w:type="spellEnd"/>
@@ -1181,17 +1311,25 @@
           <w:lang w:val="fr-FR"/>
         </w:rPr>
       </w:pPr>
+      <w:proofErr w:type="gramStart"/>
       <w:r>
         <w:rPr>
           <w:lang w:val="fr-FR"/>
         </w:rPr>
-        <w:t>source("R/</w:t>
-      </w:r>
-      <w:proofErr w:type="spellStart"/>
+        <w:t>source</w:t>
+      </w:r>
+      <w:proofErr w:type="gramEnd"/>
       <w:r>
         <w:rPr>
           <w:lang w:val="fr-FR"/>
         </w:rPr>
+        <w:t>("R/</w:t>
+      </w:r>
+      <w:proofErr w:type="spellStart"/>
+      <w:r>
+        <w:rPr>
+          <w:lang w:val="fr-FR"/>
+        </w:rPr>
         <w:t>noiseTraj.R</w:t>
       </w:r>
       <w:proofErr w:type="spellEnd"/>
@@ -1209,20 +1347,30 @@
           <w:lang w:val="fr-FR"/>
         </w:rPr>
       </w:pPr>
+      <w:proofErr w:type="gramStart"/>
       <w:r>
         <w:rPr>
           <w:lang w:val="fr-FR"/>
         </w:rPr>
-        <w:t>source("R/</w:t>
-      </w:r>
-      <w:proofErr w:type="spellStart"/>
+        <w:t>source</w:t>
+      </w:r>
+      <w:proofErr w:type="gramEnd"/>
       <w:r>
         <w:rPr>
           <w:lang w:val="fr-FR"/>
         </w:rPr>
+        <w:t>("R/</w:t>
+      </w:r>
+      <w:proofErr w:type="spellStart"/>
+      <w:proofErr w:type="gramStart"/>
+      <w:r>
+        <w:rPr>
+          <w:lang w:val="fr-FR"/>
+        </w:rPr>
         <w:t>plot.R</w:t>
       </w:r>
       <w:proofErr w:type="spellEnd"/>
+      <w:proofErr w:type="gramEnd"/>
       <w:r>
         <w:rPr>
           <w:lang w:val="fr-FR"/>
@@ -1237,20 +1385,30 @@
           <w:lang w:val="fr-FR"/>
         </w:rPr>
       </w:pPr>
+      <w:proofErr w:type="gramStart"/>
       <w:r>
         <w:rPr>
           <w:lang w:val="fr-FR"/>
         </w:rPr>
-        <w:t>source("R/</w:t>
-      </w:r>
-      <w:proofErr w:type="spellStart"/>
+        <w:t>source</w:t>
+      </w:r>
+      <w:proofErr w:type="gramEnd"/>
       <w:r>
         <w:rPr>
           <w:lang w:val="fr-FR"/>
         </w:rPr>
+        <w:t>("R/</w:t>
+      </w:r>
+      <w:proofErr w:type="spellStart"/>
+      <w:proofErr w:type="gramStart"/>
+      <w:r>
+        <w:rPr>
+          <w:lang w:val="fr-FR"/>
+        </w:rPr>
         <w:t>print.R</w:t>
       </w:r>
       <w:proofErr w:type="spellEnd"/>
+      <w:proofErr w:type="gramEnd"/>
       <w:r>
         <w:rPr>
           <w:lang w:val="fr-FR"/>
@@ -1305,7 +1463,21 @@
         <w:rPr>
           <w:lang w:val="en-US"/>
         </w:rPr>
-        <w:t>times &lt;- list("value" = 20, "</w:t>
+        <w:t xml:space="preserve">times &lt;- </w:t>
+      </w:r>
+      <w:proofErr w:type="gramStart"/>
+      <w:r>
+        <w:rPr>
+          <w:lang w:val="en-US"/>
+        </w:rPr>
+        <w:t>list(</w:t>
+      </w:r>
+      <w:proofErr w:type="gramEnd"/>
+      <w:r>
+        <w:rPr>
+          <w:lang w:val="en-US"/>
+        </w:rPr>
+        <w:t>"value" = 20, "</w:t>
       </w:r>
       <w:proofErr w:type="spellStart"/>
       <w:r>
@@ -1336,6 +1508,7 @@
         <w:t xml:space="preserve">break.3 &lt;- </w:t>
       </w:r>
       <w:proofErr w:type="spellStart"/>
+      <w:proofErr w:type="gramStart"/>
       <w:r>
         <w:rPr>
           <w:lang w:val="en-US"/>
@@ -1343,6 +1516,7 @@
         <w:t>data.frame</w:t>
       </w:r>
       <w:proofErr w:type="spellEnd"/>
+      <w:proofErr w:type="gramEnd"/>
       <w:r>
         <w:rPr>
           <w:lang w:val="en-US"/>
@@ -1361,7 +1535,21 @@
         <w:rPr>
           <w:lang w:val="en-US"/>
         </w:rPr>
-        <w:t xml:space="preserve">  pattern = c(1, 1, NA),</w:t>
+        <w:t xml:space="preserve">  pattern = </w:t>
+      </w:r>
+      <w:proofErr w:type="gramStart"/>
+      <w:r>
+        <w:rPr>
+          <w:lang w:val="en-US"/>
+        </w:rPr>
+        <w:t>c(</w:t>
+      </w:r>
+      <w:proofErr w:type="gramEnd"/>
+      <w:r>
+        <w:rPr>
+          <w:lang w:val="en-US"/>
+        </w:rPr>
+        <w:t>1, 1, NA),</w:t>
       </w:r>
     </w:p>
     <w:p>
@@ -1389,7 +1577,35 @@
         <w:rPr>
           <w:lang w:val="en-US"/>
         </w:rPr>
-        <w:t xml:space="preserve"> = c(0, 180, 300),    # psi, time coordinate of breakpoints</w:t>
+        <w:t xml:space="preserve"> = </w:t>
+      </w:r>
+      <w:proofErr w:type="gramStart"/>
+      <w:r>
+        <w:rPr>
+          <w:lang w:val="en-US"/>
+        </w:rPr>
+        <w:t>c(</w:t>
+      </w:r>
+      <w:proofErr w:type="gramEnd"/>
+      <w:r>
+        <w:rPr>
+          <w:lang w:val="en-US"/>
+        </w:rPr>
+        <w:t>0, 180, 300</w:t>
+      </w:r>
+      <w:proofErr w:type="gramStart"/>
+      <w:r>
+        <w:rPr>
+          <w:lang w:val="en-US"/>
+        </w:rPr>
+        <w:t xml:space="preserve">),   </w:t>
+      </w:r>
+      <w:proofErr w:type="gramEnd"/>
+      <w:r>
+        <w:rPr>
+          <w:lang w:val="en-US"/>
+        </w:rPr>
+        <w:t xml:space="preserve"> # psi, time coordinate of breakpoints</w:t>
       </w:r>
     </w:p>
     <w:p>
@@ -1406,6 +1622,7 @@
         <w:t xml:space="preserve">  </w:t>
       </w:r>
       <w:proofErr w:type="spellStart"/>
+      <w:proofErr w:type="gramStart"/>
       <w:r>
         <w:rPr>
           <w:lang w:val="en-US"/>
@@ -1413,11 +1630,40 @@
         <w:t>bp.y</w:t>
       </w:r>
       <w:proofErr w:type="spellEnd"/>
-      <w:r>
-        <w:rPr>
-          <w:lang w:val="en-US"/>
-        </w:rPr>
-        <w:t xml:space="preserve"> = c(0, 9.5, 1),      # height of breakpoints</w:t>
+      <w:proofErr w:type="gramEnd"/>
+      <w:r>
+        <w:rPr>
+          <w:lang w:val="en-US"/>
+        </w:rPr>
+        <w:t xml:space="preserve"> = </w:t>
+      </w:r>
+      <w:proofErr w:type="gramStart"/>
+      <w:r>
+        <w:rPr>
+          <w:lang w:val="en-US"/>
+        </w:rPr>
+        <w:t>c(</w:t>
+      </w:r>
+      <w:proofErr w:type="gramEnd"/>
+      <w:r>
+        <w:rPr>
+          <w:lang w:val="en-US"/>
+        </w:rPr>
+        <w:t>0, 9.5, 1</w:t>
+      </w:r>
+      <w:proofErr w:type="gramStart"/>
+      <w:r>
+        <w:rPr>
+          <w:lang w:val="en-US"/>
+        </w:rPr>
+        <w:t xml:space="preserve">),   </w:t>
+      </w:r>
+      <w:proofErr w:type="gramEnd"/>
+      <w:r>
+        <w:rPr>
+          <w:lang w:val="en-US"/>
+        </w:rPr>
+        <w:t xml:space="preserve">   # height of breakpoints</w:t>
       </w:r>
     </w:p>
     <w:p>
@@ -1437,13 +1683,41 @@
         <w:rPr>
           <w:lang w:val="fr-FR"/>
         </w:rPr>
-        <w:t xml:space="preserve">bp.x.sd = c(0, 50, 50),   # noise </w:t>
-      </w:r>
-      <w:proofErr w:type="spellStart"/>
+        <w:t xml:space="preserve">bp.x.sd = </w:t>
+      </w:r>
+      <w:proofErr w:type="gramStart"/>
       <w:r>
         <w:rPr>
           <w:lang w:val="fr-FR"/>
         </w:rPr>
+        <w:t>c(</w:t>
+      </w:r>
+      <w:proofErr w:type="gramEnd"/>
+      <w:r>
+        <w:rPr>
+          <w:lang w:val="fr-FR"/>
+        </w:rPr>
+        <w:t>0, 50, 50</w:t>
+      </w:r>
+      <w:proofErr w:type="gramStart"/>
+      <w:r>
+        <w:rPr>
+          <w:lang w:val="fr-FR"/>
+        </w:rPr>
+        <w:t xml:space="preserve">),   </w:t>
+      </w:r>
+      <w:proofErr w:type="gramEnd"/>
+      <w:r>
+        <w:rPr>
+          <w:lang w:val="fr-FR"/>
+        </w:rPr>
+        <w:t xml:space="preserve"># noise </w:t>
+      </w:r>
+      <w:proofErr w:type="spellStart"/>
+      <w:r>
+        <w:rPr>
+          <w:lang w:val="fr-FR"/>
+        </w:rPr>
         <w:t>levels</w:t>
       </w:r>
       <w:proofErr w:type="spellEnd"/>
@@ -1465,7 +1739,21 @@
         <w:rPr>
           <w:lang w:val="en-US"/>
         </w:rPr>
-        <w:t>bp.y.sd = c(0, 1, 1)</w:t>
+        <w:t xml:space="preserve">bp.y.sd = </w:t>
+      </w:r>
+      <w:proofErr w:type="gramStart"/>
+      <w:r>
+        <w:rPr>
+          <w:lang w:val="en-US"/>
+        </w:rPr>
+        <w:t>c(</w:t>
+      </w:r>
+      <w:proofErr w:type="gramEnd"/>
+      <w:r>
+        <w:rPr>
+          <w:lang w:val="en-US"/>
+        </w:rPr>
+        <w:t>0, 1, 1)</w:t>
       </w:r>
     </w:p>
     <w:p>
@@ -1498,6 +1786,7 @@
         </w:rPr>
       </w:pPr>
       <w:proofErr w:type="spellStart"/>
+      <w:proofErr w:type="gramStart"/>
       <w:r>
         <w:rPr>
           <w:lang w:val="en-US"/>
@@ -1505,6 +1794,7 @@
         <w:t>outlier.prob</w:t>
       </w:r>
       <w:proofErr w:type="spellEnd"/>
+      <w:proofErr w:type="gramEnd"/>
       <w:r>
         <w:rPr>
           <w:lang w:val="en-US"/>
@@ -1520,6 +1810,7 @@
         </w:rPr>
       </w:pPr>
       <w:proofErr w:type="spellStart"/>
+      <w:proofErr w:type="gramStart"/>
       <w:r>
         <w:rPr>
           <w:lang w:val="en-US"/>
@@ -1527,6 +1818,7 @@
         <w:t>na.prob</w:t>
       </w:r>
       <w:proofErr w:type="spellEnd"/>
+      <w:proofErr w:type="gramEnd"/>
       <w:r>
         <w:rPr>
           <w:lang w:val="en-US"/>
@@ -1542,6 +1834,7 @@
         </w:rPr>
       </w:pPr>
       <w:proofErr w:type="spellStart"/>
+      <w:proofErr w:type="gramStart"/>
       <w:r>
         <w:rPr>
           <w:lang w:val="en-US"/>
@@ -1549,6 +1842,7 @@
         <w:t>n.trail</w:t>
       </w:r>
       <w:proofErr w:type="spellEnd"/>
+      <w:proofErr w:type="gramEnd"/>
       <w:r>
         <w:rPr>
           <w:lang w:val="en-US"/>
@@ -1578,6 +1872,7 @@
         </w:rPr>
       </w:pPr>
       <w:proofErr w:type="spellStart"/>
+      <w:proofErr w:type="gramStart"/>
       <w:r>
         <w:rPr>
           <w:lang w:val="en-US"/>
@@ -1585,11 +1880,26 @@
         <w:t>break.min.dist</w:t>
       </w:r>
       <w:proofErr w:type="spellEnd"/>
-      <w:r>
-        <w:rPr>
-          <w:lang w:val="en-US"/>
-        </w:rPr>
-        <w:t xml:space="preserve"> &lt;- list(x = 45, y = 0) # min between-breakpoints distance</w:t>
+      <w:proofErr w:type="gramEnd"/>
+      <w:r>
+        <w:rPr>
+          <w:lang w:val="en-US"/>
+        </w:rPr>
+        <w:t xml:space="preserve"> &lt;- </w:t>
+      </w:r>
+      <w:proofErr w:type="gramStart"/>
+      <w:r>
+        <w:rPr>
+          <w:lang w:val="en-US"/>
+        </w:rPr>
+        <w:t>list(</w:t>
+      </w:r>
+      <w:proofErr w:type="gramEnd"/>
+      <w:r>
+        <w:rPr>
+          <w:lang w:val="en-US"/>
+        </w:rPr>
+        <w:t>x = 45, y = 0) # min between-breakpoints distance</w:t>
       </w:r>
     </w:p>
     <w:p>
@@ -1666,6 +1976,7 @@
         </w:rPr>
       </w:pPr>
       <w:proofErr w:type="spellStart"/>
+      <w:proofErr w:type="gramStart"/>
       <w:r>
         <w:rPr>
           <w:lang w:val="en-US"/>
@@ -1673,6 +1984,7 @@
         <w:t>true.traj</w:t>
       </w:r>
       <w:proofErr w:type="spellEnd"/>
+      <w:proofErr w:type="gramEnd"/>
       <w:r>
         <w:rPr>
           <w:lang w:val="en-US"/>
@@ -1708,6 +2020,7 @@
         <w:t>plot(</w:t>
       </w:r>
       <w:proofErr w:type="spellStart"/>
+      <w:proofErr w:type="gramStart"/>
       <w:r>
         <w:rPr>
           <w:lang w:val="en-US"/>
@@ -1715,6 +2028,7 @@
         <w:t>true.traj</w:t>
       </w:r>
       <w:proofErr w:type="spellEnd"/>
+      <w:proofErr w:type="gramEnd"/>
       <w:r>
         <w:rPr>
           <w:lang w:val="en-US"/>
@@ -1752,6 +2066,7 @@
         <w:t xml:space="preserve"> &lt;- </w:t>
       </w:r>
       <w:proofErr w:type="spellStart"/>
+      <w:proofErr w:type="gramStart"/>
       <w:r>
         <w:rPr>
           <w:lang w:val="en-US"/>
@@ -1773,6 +2088,7 @@
         <w:t>true.traj</w:t>
       </w:r>
       <w:proofErr w:type="spellEnd"/>
+      <w:proofErr w:type="gramEnd"/>
       <w:r>
         <w:rPr>
           <w:lang w:val="en-US"/>
@@ -1826,9 +2142,17 @@
         <w:rPr>
           <w:lang w:val="en-US"/>
         </w:rPr>
-        <w:t>break.x.dist</w:t>
-      </w:r>
-      <w:proofErr w:type="spellEnd"/>
+        <w:t>break.</w:t>
+      </w:r>
+      <w:proofErr w:type="gramStart"/>
+      <w:r>
+        <w:rPr>
+          <w:lang w:val="en-US"/>
+        </w:rPr>
+        <w:t>x.dist</w:t>
+      </w:r>
+      <w:proofErr w:type="spellEnd"/>
+      <w:proofErr w:type="gramEnd"/>
       <w:r>
         <w:rPr>
           <w:lang w:val="en-US"/>
@@ -1850,6 +2174,7 @@
         <w:t xml:space="preserve">                      </w:t>
       </w:r>
       <w:proofErr w:type="spellStart"/>
+      <w:proofErr w:type="gramStart"/>
       <w:r>
         <w:rPr>
           <w:lang w:val="en-US"/>
@@ -1857,6 +2182,7 @@
         <w:t>outlier.prob</w:t>
       </w:r>
       <w:proofErr w:type="spellEnd"/>
+      <w:proofErr w:type="gramEnd"/>
       <w:r>
         <w:rPr>
           <w:lang w:val="en-US"/>
@@ -1864,6 +2190,7 @@
         <w:t xml:space="preserve"> = </w:t>
       </w:r>
       <w:proofErr w:type="spellStart"/>
+      <w:proofErr w:type="gramStart"/>
       <w:r>
         <w:rPr>
           <w:lang w:val="en-US"/>
@@ -1871,6 +2198,7 @@
         <w:t>outlier.prob</w:t>
       </w:r>
       <w:proofErr w:type="spellEnd"/>
+      <w:proofErr w:type="gramEnd"/>
       <w:r>
         <w:rPr>
           <w:lang w:val="en-US"/>
@@ -1878,6 +2206,7 @@
         <w:t xml:space="preserve">, </w:t>
       </w:r>
       <w:proofErr w:type="spellStart"/>
+      <w:proofErr w:type="gramStart"/>
       <w:r>
         <w:rPr>
           <w:lang w:val="en-US"/>
@@ -1885,6 +2214,7 @@
         <w:t>na.prob</w:t>
       </w:r>
       <w:proofErr w:type="spellEnd"/>
+      <w:proofErr w:type="gramEnd"/>
       <w:r>
         <w:rPr>
           <w:lang w:val="en-US"/>
@@ -1892,6 +2222,7 @@
         <w:t xml:space="preserve"> = </w:t>
       </w:r>
       <w:proofErr w:type="spellStart"/>
+      <w:proofErr w:type="gramStart"/>
       <w:r>
         <w:rPr>
           <w:lang w:val="en-US"/>
@@ -1899,6 +2230,7 @@
         <w:t>na.prob</w:t>
       </w:r>
       <w:proofErr w:type="spellEnd"/>
+      <w:proofErr w:type="gramEnd"/>
       <w:r>
         <w:rPr>
           <w:lang w:val="en-US"/>
@@ -1906,6 +2238,7 @@
         <w:t xml:space="preserve">, </w:t>
       </w:r>
       <w:proofErr w:type="spellStart"/>
+      <w:proofErr w:type="gramStart"/>
       <w:r>
         <w:rPr>
           <w:lang w:val="en-US"/>
@@ -1913,6 +2246,7 @@
         <w:t>n.trail</w:t>
       </w:r>
       <w:proofErr w:type="spellEnd"/>
+      <w:proofErr w:type="gramEnd"/>
       <w:r>
         <w:rPr>
           <w:lang w:val="en-US"/>
@@ -1920,6 +2254,7 @@
         <w:t xml:space="preserve"> = </w:t>
       </w:r>
       <w:proofErr w:type="spellStart"/>
+      <w:proofErr w:type="gramStart"/>
       <w:r>
         <w:rPr>
           <w:lang w:val="en-US"/>
@@ -1927,6 +2262,7 @@
         <w:t>n.trail</w:t>
       </w:r>
       <w:proofErr w:type="spellEnd"/>
+      <w:proofErr w:type="gramEnd"/>
       <w:r>
         <w:rPr>
           <w:lang w:val="en-US"/>

</xml_diff>